<commit_message>
Fix config parsing for real openclaw.json structure and add error diagnostics
- Restructure OpenClawConfig to match real format: agents is {defaults, list}
  dict (not array), models.providers is keyed dict (not array)
- Add custom AgentConfig decoder to handle model field as either String or
  {primary, fallbacks} object
- Enrich agents with agents.defaults.model.primary when no per-agent model set
- Add ConfigService.lastError with human-readable DecodingError messages
- Show parse error detail in Demo Mode banner so users can diagnose failures
- Update PRD with section 4.6 documenting the error diagnostics mechanism
  and the real openclaw.json structure differences

Co-Authored-By: Claude Sonnet 4.6 <noreply@anthropic.com>
</commit_message>
<xml_diff>
--- a/OpenClaw-Monitor-macOS-PRD.docx
+++ b/OpenClaw-Monitor-macOS-PRD.docx
@@ -3630,7 +3630,7 @@
                 <w:sz w:val="20"/>
                 <w:szCs w:val="20"/>
               </w:rPr>
-              <w:t xml:space="preserve">P2 增强</w:t>
+              <w:t xml:space="preserve">P1 重要</w:t>
             </w:r>
           </w:p>
         </w:tc>
@@ -3662,7 +3662,7 @@
                 <w:sz w:val="20"/>
                 <w:szCs w:val="20"/>
               </w:rPr>
-              <w:t xml:space="preserve">像素办公室</w:t>
+              <w:t xml:space="preserve">Cron 任务查看</w:t>
             </w:r>
           </w:p>
         </w:tc>
@@ -3694,7 +3694,7 @@
                 <w:sz w:val="20"/>
                 <w:szCs w:val="20"/>
               </w:rPr>
-              <w:t xml:space="preserve">SpriteKit 动画场景</w:t>
+              <w:t xml:space="preserve">只读展示定时任务 + 启用/禁用/立即运行</w:t>
             </w:r>
           </w:p>
         </w:tc>
@@ -3762,7 +3762,7 @@
                 <w:sz w:val="20"/>
                 <w:szCs w:val="20"/>
               </w:rPr>
-              <w:t xml:space="preserve">主题切换</w:t>
+              <w:t xml:space="preserve">像素办公室</w:t>
             </w:r>
           </w:p>
         </w:tc>
@@ -3795,7 +3795,7 @@
                 <w:sz w:val="20"/>
                 <w:szCs w:val="20"/>
               </w:rPr>
-              <w:t xml:space="preserve">默认 Dark，Settings 可切换 Light / 跟随系统</w:t>
+              <w:t xml:space="preserve">SpriteKit 动画场景</w:t>
             </w:r>
           </w:p>
         </w:tc>
@@ -3861,7 +3861,7 @@
                 <w:sz w:val="20"/>
                 <w:szCs w:val="20"/>
               </w:rPr>
-              <w:t xml:space="preserve">国际化 (i18n)</w:t>
+              <w:t xml:space="preserve">主题切换</w:t>
             </w:r>
           </w:p>
         </w:tc>
@@ -3893,7 +3893,7 @@
                 <w:sz w:val="20"/>
                 <w:szCs w:val="20"/>
               </w:rPr>
-              <w:t xml:space="preserve">中/英文切换</w:t>
+              <w:t xml:space="preserve">默认 Dark，Settings 可切换 Light / 跟随系统</w:t>
             </w:r>
           </w:p>
         </w:tc>
@@ -3961,7 +3961,7 @@
                 <w:sz w:val="20"/>
                 <w:szCs w:val="20"/>
               </w:rPr>
-              <w:t xml:space="preserve">开机自启动</w:t>
+              <w:t xml:space="preserve">国际化 (i18n)</w:t>
             </w:r>
           </w:p>
         </w:tc>
@@ -3994,7 +3994,7 @@
                 <w:sz w:val="20"/>
                 <w:szCs w:val="20"/>
               </w:rPr>
-              <w:t xml:space="preserve">Login Item 支持</w:t>
+              <w:t xml:space="preserve">中/英文切换</w:t>
             </w:r>
           </w:p>
         </w:tc>
@@ -4060,6 +4060,106 @@
                 <w:sz w:val="20"/>
                 <w:szCs w:val="20"/>
               </w:rPr>
+              <w:t xml:space="preserve">开机自启动</w:t>
+            </w:r>
+          </w:p>
+        </w:tc>
+        <w:tc>
+          <w:tcPr>
+            <w:tcW w:type="dxa" w:w="5560"/>
+            <w:tcBorders>
+              <w:top w:val="single" w:color="CBD5E1" w:sz="1"/>
+              <w:left w:val="single" w:color="CBD5E1" w:sz="1"/>
+              <w:bottom w:val="single" w:color="CBD5E1" w:sz="1"/>
+              <w:right w:val="single" w:color="CBD5E1" w:sz="1"/>
+            </w:tcBorders>
+            <w:tcMar>
+              <w:top w:type="dxa" w:w="60"/>
+              <w:left w:type="dxa" w:w="120"/>
+              <w:bottom w:type="dxa" w:w="60"/>
+              <w:right w:type="dxa" w:w="120"/>
+            </w:tcMar>
+            <w:vAlign w:val="center"/>
+          </w:tcPr>
+          <w:p>
+            <w:pPr>
+              <w:spacing w:after="0"/>
+            </w:pPr>
+            <w:r>
+              <w:rPr>
+                <w:rFonts w:ascii="Arial" w:cs="Arial" w:eastAsia="Arial" w:hAnsi="Arial"/>
+                <w:color w:val="1E293B"/>
+                <w:sz w:val="20"/>
+                <w:szCs w:val="20"/>
+              </w:rPr>
+              <w:t xml:space="preserve">Login Item 支持</w:t>
+            </w:r>
+          </w:p>
+        </w:tc>
+      </w:tr>
+      <w:tr>
+        <w:tc>
+          <w:tcPr>
+            <w:tcW w:type="dxa" w:w="1200"/>
+            <w:tcBorders>
+              <w:top w:val="single" w:color="CBD5E1" w:sz="1"/>
+              <w:left w:val="single" w:color="CBD5E1" w:sz="1"/>
+              <w:bottom w:val="single" w:color="CBD5E1" w:sz="1"/>
+              <w:right w:val="single" w:color="CBD5E1" w:sz="1"/>
+            </w:tcBorders>
+            <w:shd w:fill="F8FAFC" w:val="clear"/>
+            <w:tcMar>
+              <w:top w:type="dxa" w:w="60"/>
+              <w:left w:type="dxa" w:w="120"/>
+              <w:bottom w:type="dxa" w:w="60"/>
+              <w:right w:type="dxa" w:w="120"/>
+            </w:tcMar>
+            <w:vAlign w:val="center"/>
+          </w:tcPr>
+          <w:p>
+            <w:pPr>
+              <w:spacing w:after="0"/>
+            </w:pPr>
+            <w:r>
+              <w:rPr>
+                <w:rFonts w:ascii="Arial" w:cs="Arial" w:eastAsia="Arial" w:hAnsi="Arial"/>
+                <w:color w:val="1E293B"/>
+                <w:sz w:val="20"/>
+                <w:szCs w:val="20"/>
+              </w:rPr>
+              <w:t xml:space="preserve">P2 增强</w:t>
+            </w:r>
+          </w:p>
+        </w:tc>
+        <w:tc>
+          <w:tcPr>
+            <w:tcW w:type="dxa" w:w="2600"/>
+            <w:tcBorders>
+              <w:top w:val="single" w:color="CBD5E1" w:sz="1"/>
+              <w:left w:val="single" w:color="CBD5E1" w:sz="1"/>
+              <w:bottom w:val="single" w:color="CBD5E1" w:sz="1"/>
+              <w:right w:val="single" w:color="CBD5E1" w:sz="1"/>
+            </w:tcBorders>
+            <w:shd w:fill="F8FAFC" w:val="clear"/>
+            <w:tcMar>
+              <w:top w:type="dxa" w:w="60"/>
+              <w:left w:type="dxa" w:w="120"/>
+              <w:bottom w:type="dxa" w:w="60"/>
+              <w:right w:type="dxa" w:w="120"/>
+            </w:tcMar>
+            <w:vAlign w:val="center"/>
+          </w:tcPr>
+          <w:p>
+            <w:pPr>
+              <w:spacing w:after="0"/>
+            </w:pPr>
+            <w:r>
+              <w:rPr>
+                <w:rFonts w:ascii="Arial" w:cs="Arial" w:eastAsia="Arial" w:hAnsi="Arial"/>
+                <w:color w:val="1E293B"/>
+                <w:sz w:val="20"/>
+                <w:szCs w:val="20"/>
+              </w:rPr>
               <w:t xml:space="preserve">DMG 打包</w:t>
             </w:r>
           </w:p>
@@ -4073,6 +4173,7 @@
               <w:bottom w:val="single" w:color="CBD5E1" w:sz="1"/>
               <w:right w:val="single" w:color="CBD5E1" w:sz="1"/>
             </w:tcBorders>
+            <w:shd w:fill="F8FAFC" w:val="clear"/>
             <w:tcMar>
               <w:top w:type="dxa" w:w="60"/>
               <w:left w:type="dxa" w:w="120"/>
@@ -5542,6 +5643,105 @@
                 <w:sz w:val="20"/>
                 <w:szCs w:val="20"/>
               </w:rPr>
+              <w:t xml:space="preserve">clock.badge</w:t>
+            </w:r>
+          </w:p>
+        </w:tc>
+        <w:tc>
+          <w:tcPr>
+            <w:tcW w:type="dxa" w:w="2400"/>
+            <w:tcBorders>
+              <w:top w:val="single" w:color="CBD5E1" w:sz="1"/>
+              <w:left w:val="single" w:color="CBD5E1" w:sz="1"/>
+              <w:bottom w:val="single" w:color="CBD5E1" w:sz="1"/>
+              <w:right w:val="single" w:color="CBD5E1" w:sz="1"/>
+            </w:tcBorders>
+            <w:tcMar>
+              <w:top w:type="dxa" w:w="60"/>
+              <w:left w:type="dxa" w:w="120"/>
+              <w:bottom w:type="dxa" w:w="60"/>
+              <w:right w:type="dxa" w:w="120"/>
+            </w:tcMar>
+            <w:vAlign w:val="center"/>
+          </w:tcPr>
+          <w:p>
+            <w:pPr>
+              <w:spacing w:after="0"/>
+            </w:pPr>
+            <w:r>
+              <w:rPr>
+                <w:rFonts w:ascii="Arial" w:cs="Arial" w:eastAsia="Arial" w:hAnsi="Arial"/>
+                <w:color w:val="1E293B"/>
+                <w:sz w:val="20"/>
+                <w:szCs w:val="20"/>
+              </w:rPr>
+              <w:t xml:space="preserve">Cron Jobs</w:t>
+            </w:r>
+          </w:p>
+        </w:tc>
+        <w:tc>
+          <w:tcPr>
+            <w:tcW w:type="dxa" w:w="4560"/>
+            <w:tcBorders>
+              <w:top w:val="single" w:color="CBD5E1" w:sz="1"/>
+              <w:left w:val="single" w:color="CBD5E1" w:sz="1"/>
+              <w:bottom w:val="single" w:color="CBD5E1" w:sz="1"/>
+              <w:right w:val="single" w:color="CBD5E1" w:sz="1"/>
+            </w:tcBorders>
+            <w:tcMar>
+              <w:top w:type="dxa" w:w="60"/>
+              <w:left w:type="dxa" w:w="120"/>
+              <w:bottom w:type="dxa" w:w="60"/>
+              <w:right w:type="dxa" w:w="120"/>
+            </w:tcMar>
+            <w:vAlign w:val="center"/>
+          </w:tcPr>
+          <w:p>
+            <w:pPr>
+              <w:spacing w:after="0"/>
+            </w:pPr>
+            <w:r>
+              <w:rPr>
+                <w:rFonts w:ascii="Arial" w:cs="Arial" w:eastAsia="Arial" w:hAnsi="Arial"/>
+                <w:color w:val="1E293B"/>
+                <w:sz w:val="20"/>
+                <w:szCs w:val="20"/>
+              </w:rPr>
+              <w:t xml:space="preserve">Cron 定时任务页</w:t>
+            </w:r>
+          </w:p>
+        </w:tc>
+      </w:tr>
+      <w:tr>
+        <w:tc>
+          <w:tcPr>
+            <w:tcW w:type="dxa" w:w="2400"/>
+            <w:tcBorders>
+              <w:top w:val="single" w:color="CBD5E1" w:sz="1"/>
+              <w:left w:val="single" w:color="CBD5E1" w:sz="1"/>
+              <w:bottom w:val="single" w:color="CBD5E1" w:sz="1"/>
+              <w:right w:val="single" w:color="CBD5E1" w:sz="1"/>
+            </w:tcBorders>
+            <w:shd w:fill="F8FAFC" w:val="clear"/>
+            <w:tcMar>
+              <w:top w:type="dxa" w:w="60"/>
+              <w:left w:type="dxa" w:w="120"/>
+              <w:bottom w:type="dxa" w:w="60"/>
+              <w:right w:type="dxa" w:w="120"/>
+            </w:tcMar>
+            <w:vAlign w:val="center"/>
+          </w:tcPr>
+          <w:p>
+            <w:pPr>
+              <w:spacing w:after="0"/>
+            </w:pPr>
+            <w:r>
+              <w:rPr>
+                <w:rFonts w:ascii="Arial" w:cs="Arial" w:eastAsia="Arial" w:hAnsi="Arial"/>
+                <w:color w:val="1E293B"/>
+                <w:sz w:val="20"/>
+                <w:szCs w:val="20"/>
+              </w:rPr>
               <w:t xml:space="preserve">gamecontroller</w:t>
             </w:r>
           </w:p>
@@ -5555,6 +5755,7 @@
               <w:bottom w:val="single" w:color="CBD5E1" w:sz="1"/>
               <w:right w:val="single" w:color="CBD5E1" w:sz="1"/>
             </w:tcBorders>
+            <w:shd w:fill="F8FAFC" w:val="clear"/>
             <w:tcMar>
               <w:top w:type="dxa" w:w="60"/>
               <w:left w:type="dxa" w:w="120"/>
@@ -5587,6 +5788,7 @@
               <w:bottom w:val="single" w:color="CBD5E1" w:sz="1"/>
               <w:right w:val="single" w:color="CBD5E1" w:sz="1"/>
             </w:tcBorders>
+            <w:shd w:fill="F8FAFC" w:val="clear"/>
             <w:tcMar>
               <w:top w:type="dxa" w:w="60"/>
               <w:left w:type="dxa" w:w="120"/>
@@ -15479,6 +15681,1896 @@
       </w:r>
     </w:p>
     <w:p>
+      <w:pPr>
+        <w:spacing w:after="200"/>
+      </w:pPr>
+    </w:p>
+    <w:p>
+      <w:pPr>
+        <w:pStyle w:val="Heading2"/>
+      </w:pPr>
+      <w:r>
+        <w:t xml:space="preserve">3.12 Cron 任务查看页</w:t>
+      </w:r>
+    </w:p>
+    <w:p>
+      <w:pPr>
+        <w:spacing w:after="160" w:line="320"/>
+      </w:pPr>
+      <w:r>
+        <w:rPr>
+          <w:rFonts w:ascii="Arial" w:cs="Arial" w:eastAsia="Arial" w:hAnsi="Arial"/>
+          <w:color w:val="1E293B"/>
+          <w:sz w:val="22"/>
+          <w:szCs w:val="22"/>
+        </w:rPr>
+        <w:t xml:space="preserve">只读展示所有已配置的定时任务，并提供快捷操作。Cron 是 OpenClaw 的核心自动化能力，也是 Token 消耗的重要来源，监控其状态对成本管控很有价值。</w:t>
+      </w:r>
+    </w:p>
+    <w:p>
+      <w:pPr>
+        <w:pStyle w:val="Heading3"/>
+      </w:pPr>
+      <w:r>
+        <w:t xml:space="preserve">3.12.1 数据来源</w:t>
+      </w:r>
+    </w:p>
+    <w:p>
+      <w:pPr>
+        <w:pStyle w:val="ListParagraph"/>
+        <w:numPr>
+          <w:ilvl w:val="0"/>
+          <w:numId w:val="11"/>
+        </w:numPr>
+        <w:spacing w:after="70" w:line="300"/>
+      </w:pPr>
+      <w:r>
+        <w:rPr>
+          <w:rFonts w:ascii="Arial" w:cs="Arial" w:eastAsia="Arial" w:hAnsi="Arial"/>
+          <w:color w:val="1E293B"/>
+          <w:sz w:val="22"/>
+          <w:szCs w:val="22"/>
+        </w:rPr>
+        <w:t xml:space="preserve">直接读取 ~/.openclaw/cron/jobs.json，无需 Gateway 在线</w:t>
+      </w:r>
+    </w:p>
+    <w:p>
+      <w:pPr>
+        <w:pStyle w:val="ListParagraph"/>
+        <w:numPr>
+          <w:ilvl w:val="0"/>
+          <w:numId w:val="11"/>
+        </w:numPr>
+        <w:spacing w:after="70" w:line="300"/>
+      </w:pPr>
+      <w:r>
+        <w:rPr>
+          <w:rFonts w:ascii="Arial" w:cs="Arial" w:eastAsia="Arial" w:hAnsi="Arial"/>
+          <w:color w:val="1E293B"/>
+          <w:sz w:val="22"/>
+          <w:szCs w:val="22"/>
+        </w:rPr>
+        <w:t xml:space="preserve">运行历史从 ~/.openclaw/cron/runs/&lt;jobId&gt;.jsonl 读取</w:t>
+      </w:r>
+    </w:p>
+    <w:p>
+      <w:pPr>
+        <w:pStyle w:val="ListParagraph"/>
+        <w:numPr>
+          <w:ilvl w:val="0"/>
+          <w:numId w:val="11"/>
+        </w:numPr>
+        <w:spacing w:after="70" w:line="300"/>
+      </w:pPr>
+      <w:r>
+        <w:rPr>
+          <w:rFonts w:ascii="Arial" w:cs="Arial" w:eastAsia="Arial" w:hAnsi="Arial"/>
+          <w:color w:val="1E293B"/>
+          <w:sz w:val="22"/>
+          <w:szCs w:val="22"/>
+        </w:rPr>
+        <w:t xml:space="preserve">与配置文件一样，使用 FileWatcher 监听 jobs.json 变更自动刷新</w:t>
+      </w:r>
+    </w:p>
+    <w:p>
+      <w:pPr>
+        <w:pStyle w:val="Heading3"/>
+      </w:pPr>
+      <w:r>
+        <w:t xml:space="preserve">3.12.2 列表展示字段</w:t>
+      </w:r>
+    </w:p>
+    <w:tbl>
+      <w:tblPr>
+        <w:tblW w:type="dxa" w:w="9360"/>
+        <w:tblBorders>
+          <w:top w:val="single" w:color="auto" w:sz="4"/>
+          <w:left w:val="single" w:color="auto" w:sz="4"/>
+          <w:bottom w:val="single" w:color="auto" w:sz="4"/>
+          <w:right w:val="single" w:color="auto" w:sz="4"/>
+          <w:insideH w:val="single" w:color="auto" w:sz="4"/>
+          <w:insideV w:val="single" w:color="auto" w:sz="4"/>
+        </w:tblBorders>
+      </w:tblPr>
+      <w:tblGrid>
+        <w:gridCol w:w="2200"/>
+        <w:gridCol w:w="3560"/>
+        <w:gridCol w:w="3600"/>
+      </w:tblGrid>
+      <w:tr>
+        <w:trPr>
+          <w:tblHeader/>
+        </w:trPr>
+        <w:tc>
+          <w:tcPr>
+            <w:tcW w:type="dxa" w:w="2200"/>
+            <w:tcBorders>
+              <w:top w:val="single" w:color="CBD5E1" w:sz="1"/>
+              <w:left w:val="single" w:color="CBD5E1" w:sz="1"/>
+              <w:bottom w:val="single" w:color="CBD5E1" w:sz="1"/>
+              <w:right w:val="single" w:color="CBD5E1" w:sz="1"/>
+            </w:tcBorders>
+            <w:shd w:fill="1E40AF" w:val="clear"/>
+            <w:tcMar>
+              <w:top w:type="dxa" w:w="60"/>
+              <w:left w:type="dxa" w:w="120"/>
+              <w:bottom w:type="dxa" w:w="60"/>
+              <w:right w:type="dxa" w:w="120"/>
+            </w:tcMar>
+            <w:vAlign w:val="center"/>
+          </w:tcPr>
+          <w:p>
+            <w:pPr>
+              <w:spacing w:after="0"/>
+            </w:pPr>
+            <w:r>
+              <w:rPr>
+                <w:rFonts w:ascii="Arial" w:cs="Arial" w:eastAsia="Arial" w:hAnsi="Arial"/>
+                <w:b/>
+                <w:bCs/>
+                <w:color w:val="FFFFFF"/>
+                <w:sz w:val="20"/>
+                <w:szCs w:val="20"/>
+              </w:rPr>
+              <w:t xml:space="preserve">字段</w:t>
+            </w:r>
+          </w:p>
+        </w:tc>
+        <w:tc>
+          <w:tcPr>
+            <w:tcW w:type="dxa" w:w="3560"/>
+            <w:tcBorders>
+              <w:top w:val="single" w:color="CBD5E1" w:sz="1"/>
+              <w:left w:val="single" w:color="CBD5E1" w:sz="1"/>
+              <w:bottom w:val="single" w:color="CBD5E1" w:sz="1"/>
+              <w:right w:val="single" w:color="CBD5E1" w:sz="1"/>
+            </w:tcBorders>
+            <w:shd w:fill="1E40AF" w:val="clear"/>
+            <w:tcMar>
+              <w:top w:type="dxa" w:w="60"/>
+              <w:left w:type="dxa" w:w="120"/>
+              <w:bottom w:type="dxa" w:w="60"/>
+              <w:right w:type="dxa" w:w="120"/>
+            </w:tcMar>
+            <w:vAlign w:val="center"/>
+          </w:tcPr>
+          <w:p>
+            <w:pPr>
+              <w:spacing w:after="0"/>
+            </w:pPr>
+            <w:r>
+              <w:rPr>
+                <w:rFonts w:ascii="Arial" w:cs="Arial" w:eastAsia="Arial" w:hAnsi="Arial"/>
+                <w:b/>
+                <w:bCs/>
+                <w:color w:val="FFFFFF"/>
+                <w:sz w:val="20"/>
+                <w:szCs w:val="20"/>
+              </w:rPr>
+              <w:t xml:space="preserve">说明</w:t>
+            </w:r>
+          </w:p>
+        </w:tc>
+        <w:tc>
+          <w:tcPr>
+            <w:tcW w:type="dxa" w:w="3600"/>
+            <w:tcBorders>
+              <w:top w:val="single" w:color="CBD5E1" w:sz="1"/>
+              <w:left w:val="single" w:color="CBD5E1" w:sz="1"/>
+              <w:bottom w:val="single" w:color="CBD5E1" w:sz="1"/>
+              <w:right w:val="single" w:color="CBD5E1" w:sz="1"/>
+            </w:tcBorders>
+            <w:shd w:fill="1E40AF" w:val="clear"/>
+            <w:tcMar>
+              <w:top w:type="dxa" w:w="60"/>
+              <w:left w:type="dxa" w:w="120"/>
+              <w:bottom w:type="dxa" w:w="60"/>
+              <w:right w:type="dxa" w:w="120"/>
+            </w:tcMar>
+            <w:vAlign w:val="center"/>
+          </w:tcPr>
+          <w:p>
+            <w:pPr>
+              <w:spacing w:after="0"/>
+            </w:pPr>
+            <w:r>
+              <w:rPr>
+                <w:rFonts w:ascii="Arial" w:cs="Arial" w:eastAsia="Arial" w:hAnsi="Arial"/>
+                <w:b/>
+                <w:bCs/>
+                <w:color w:val="FFFFFF"/>
+                <w:sz w:val="20"/>
+                <w:szCs w:val="20"/>
+              </w:rPr>
+              <w:t xml:space="preserve">显示方式</w:t>
+            </w:r>
+          </w:p>
+        </w:tc>
+      </w:tr>
+      <w:tr>
+        <w:tc>
+          <w:tcPr>
+            <w:tcW w:type="dxa" w:w="2200"/>
+            <w:tcBorders>
+              <w:top w:val="single" w:color="CBD5E1" w:sz="1"/>
+              <w:left w:val="single" w:color="CBD5E1" w:sz="1"/>
+              <w:bottom w:val="single" w:color="CBD5E1" w:sz="1"/>
+              <w:right w:val="single" w:color="CBD5E1" w:sz="1"/>
+            </w:tcBorders>
+            <w:tcMar>
+              <w:top w:type="dxa" w:w="60"/>
+              <w:left w:type="dxa" w:w="120"/>
+              <w:bottom w:type="dxa" w:w="60"/>
+              <w:right w:type="dxa" w:w="120"/>
+            </w:tcMar>
+            <w:vAlign w:val="center"/>
+          </w:tcPr>
+          <w:p>
+            <w:pPr>
+              <w:spacing w:after="0"/>
+            </w:pPr>
+            <w:r>
+              <w:rPr>
+                <w:rFonts w:ascii="Arial" w:cs="Arial" w:eastAsia="Arial" w:hAnsi="Arial"/>
+                <w:color w:val="1E293B"/>
+                <w:sz w:val="20"/>
+                <w:szCs w:val="20"/>
+              </w:rPr>
+              <w:t xml:space="preserve">任务名称</w:t>
+            </w:r>
+          </w:p>
+        </w:tc>
+        <w:tc>
+          <w:tcPr>
+            <w:tcW w:type="dxa" w:w="3560"/>
+            <w:tcBorders>
+              <w:top w:val="single" w:color="CBD5E1" w:sz="1"/>
+              <w:left w:val="single" w:color="CBD5E1" w:sz="1"/>
+              <w:bottom w:val="single" w:color="CBD5E1" w:sz="1"/>
+              <w:right w:val="single" w:color="CBD5E1" w:sz="1"/>
+            </w:tcBorders>
+            <w:tcMar>
+              <w:top w:type="dxa" w:w="60"/>
+              <w:left w:type="dxa" w:w="120"/>
+              <w:bottom w:type="dxa" w:w="60"/>
+              <w:right w:type="dxa" w:w="120"/>
+            </w:tcMar>
+            <w:vAlign w:val="center"/>
+          </w:tcPr>
+          <w:p>
+            <w:pPr>
+              <w:spacing w:after="0"/>
+            </w:pPr>
+            <w:r>
+              <w:rPr>
+                <w:rFonts w:ascii="Arial" w:cs="Arial" w:eastAsia="Arial" w:hAnsi="Arial"/>
+                <w:color w:val="1E293B"/>
+                <w:sz w:val="20"/>
+                <w:szCs w:val="20"/>
+              </w:rPr>
+              <w:t xml:space="preserve">jobs[].name</w:t>
+            </w:r>
+          </w:p>
+        </w:tc>
+        <w:tc>
+          <w:tcPr>
+            <w:tcW w:type="dxa" w:w="3600"/>
+            <w:tcBorders>
+              <w:top w:val="single" w:color="CBD5E1" w:sz="1"/>
+              <w:left w:val="single" w:color="CBD5E1" w:sz="1"/>
+              <w:bottom w:val="single" w:color="CBD5E1" w:sz="1"/>
+              <w:right w:val="single" w:color="CBD5E1" w:sz="1"/>
+            </w:tcBorders>
+            <w:tcMar>
+              <w:top w:type="dxa" w:w="60"/>
+              <w:left w:type="dxa" w:w="120"/>
+              <w:bottom w:type="dxa" w:w="60"/>
+              <w:right w:type="dxa" w:w="120"/>
+            </w:tcMar>
+            <w:vAlign w:val="center"/>
+          </w:tcPr>
+          <w:p>
+            <w:pPr>
+              <w:spacing w:after="0"/>
+            </w:pPr>
+            <w:r>
+              <w:rPr>
+                <w:rFonts w:ascii="Arial" w:cs="Arial" w:eastAsia="Arial" w:hAnsi="Arial"/>
+                <w:color w:val="1E293B"/>
+                <w:sz w:val="20"/>
+                <w:szCs w:val="20"/>
+              </w:rPr>
+              <w:t xml:space="preserve">粗体标题</w:t>
+            </w:r>
+          </w:p>
+        </w:tc>
+      </w:tr>
+      <w:tr>
+        <w:tc>
+          <w:tcPr>
+            <w:tcW w:type="dxa" w:w="2200"/>
+            <w:tcBorders>
+              <w:top w:val="single" w:color="CBD5E1" w:sz="1"/>
+              <w:left w:val="single" w:color="CBD5E1" w:sz="1"/>
+              <w:bottom w:val="single" w:color="CBD5E1" w:sz="1"/>
+              <w:right w:val="single" w:color="CBD5E1" w:sz="1"/>
+            </w:tcBorders>
+            <w:shd w:fill="F8FAFC" w:val="clear"/>
+            <w:tcMar>
+              <w:top w:type="dxa" w:w="60"/>
+              <w:left w:type="dxa" w:w="120"/>
+              <w:bottom w:type="dxa" w:w="60"/>
+              <w:right w:type="dxa" w:w="120"/>
+            </w:tcMar>
+            <w:vAlign w:val="center"/>
+          </w:tcPr>
+          <w:p>
+            <w:pPr>
+              <w:spacing w:after="0"/>
+            </w:pPr>
+            <w:r>
+              <w:rPr>
+                <w:rFonts w:ascii="Arial" w:cs="Arial" w:eastAsia="Arial" w:hAnsi="Arial"/>
+                <w:color w:val="1E293B"/>
+                <w:sz w:val="20"/>
+                <w:szCs w:val="20"/>
+              </w:rPr>
+              <w:t xml:space="preserve">调度类型</w:t>
+            </w:r>
+          </w:p>
+        </w:tc>
+        <w:tc>
+          <w:tcPr>
+            <w:tcW w:type="dxa" w:w="3560"/>
+            <w:tcBorders>
+              <w:top w:val="single" w:color="CBD5E1" w:sz="1"/>
+              <w:left w:val="single" w:color="CBD5E1" w:sz="1"/>
+              <w:bottom w:val="single" w:color="CBD5E1" w:sz="1"/>
+              <w:right w:val="single" w:color="CBD5E1" w:sz="1"/>
+            </w:tcBorders>
+            <w:shd w:fill="F8FAFC" w:val="clear"/>
+            <w:tcMar>
+              <w:top w:type="dxa" w:w="60"/>
+              <w:left w:type="dxa" w:w="120"/>
+              <w:bottom w:type="dxa" w:w="60"/>
+              <w:right w:type="dxa" w:w="120"/>
+            </w:tcMar>
+            <w:vAlign w:val="center"/>
+          </w:tcPr>
+          <w:p>
+            <w:pPr>
+              <w:spacing w:after="0"/>
+            </w:pPr>
+            <w:r>
+              <w:rPr>
+                <w:rFonts w:ascii="Arial" w:cs="Arial" w:eastAsia="Arial" w:hAnsi="Arial"/>
+                <w:color w:val="1E293B"/>
+                <w:sz w:val="20"/>
+                <w:szCs w:val="20"/>
+              </w:rPr>
+              <w:t xml:space="preserve">cron / every / at</w:t>
+            </w:r>
+          </w:p>
+        </w:tc>
+        <w:tc>
+          <w:tcPr>
+            <w:tcW w:type="dxa" w:w="3600"/>
+            <w:tcBorders>
+              <w:top w:val="single" w:color="CBD5E1" w:sz="1"/>
+              <w:left w:val="single" w:color="CBD5E1" w:sz="1"/>
+              <w:bottom w:val="single" w:color="CBD5E1" w:sz="1"/>
+              <w:right w:val="single" w:color="CBD5E1" w:sz="1"/>
+            </w:tcBorders>
+            <w:shd w:fill="F8FAFC" w:val="clear"/>
+            <w:tcMar>
+              <w:top w:type="dxa" w:w="60"/>
+              <w:left w:type="dxa" w:w="120"/>
+              <w:bottom w:type="dxa" w:w="60"/>
+              <w:right w:type="dxa" w:w="120"/>
+            </w:tcMar>
+            <w:vAlign w:val="center"/>
+          </w:tcPr>
+          <w:p>
+            <w:pPr>
+              <w:spacing w:after="0"/>
+            </w:pPr>
+            <w:r>
+              <w:rPr>
+                <w:rFonts w:ascii="Arial" w:cs="Arial" w:eastAsia="Arial" w:hAnsi="Arial"/>
+                <w:color w:val="1E293B"/>
+                <w:sz w:val="20"/>
+                <w:szCs w:val="20"/>
+              </w:rPr>
+              <w:t xml:space="preserve">Badge: “定时” “间隔” “一次性”</w:t>
+            </w:r>
+          </w:p>
+        </w:tc>
+      </w:tr>
+      <w:tr>
+        <w:tc>
+          <w:tcPr>
+            <w:tcW w:type="dxa" w:w="2200"/>
+            <w:tcBorders>
+              <w:top w:val="single" w:color="CBD5E1" w:sz="1"/>
+              <w:left w:val="single" w:color="CBD5E1" w:sz="1"/>
+              <w:bottom w:val="single" w:color="CBD5E1" w:sz="1"/>
+              <w:right w:val="single" w:color="CBD5E1" w:sz="1"/>
+            </w:tcBorders>
+            <w:tcMar>
+              <w:top w:type="dxa" w:w="60"/>
+              <w:left w:type="dxa" w:w="120"/>
+              <w:bottom w:type="dxa" w:w="60"/>
+              <w:right w:type="dxa" w:w="120"/>
+            </w:tcMar>
+            <w:vAlign w:val="center"/>
+          </w:tcPr>
+          <w:p>
+            <w:pPr>
+              <w:spacing w:after="0"/>
+            </w:pPr>
+            <w:r>
+              <w:rPr>
+                <w:rFonts w:ascii="Arial" w:cs="Arial" w:eastAsia="Arial" w:hAnsi="Arial"/>
+                <w:color w:val="1E293B"/>
+                <w:sz w:val="20"/>
+                <w:szCs w:val="20"/>
+              </w:rPr>
+              <w:t xml:space="preserve">调度表达式</w:t>
+            </w:r>
+          </w:p>
+        </w:tc>
+        <w:tc>
+          <w:tcPr>
+            <w:tcW w:type="dxa" w:w="3560"/>
+            <w:tcBorders>
+              <w:top w:val="single" w:color="CBD5E1" w:sz="1"/>
+              <w:left w:val="single" w:color="CBD5E1" w:sz="1"/>
+              <w:bottom w:val="single" w:color="CBD5E1" w:sz="1"/>
+              <w:right w:val="single" w:color="CBD5E1" w:sz="1"/>
+            </w:tcBorders>
+            <w:tcMar>
+              <w:top w:type="dxa" w:w="60"/>
+              <w:left w:type="dxa" w:w="120"/>
+              <w:bottom w:type="dxa" w:w="60"/>
+              <w:right w:type="dxa" w:w="120"/>
+            </w:tcMar>
+            <w:vAlign w:val="center"/>
+          </w:tcPr>
+          <w:p>
+            <w:pPr>
+              <w:spacing w:after="0"/>
+            </w:pPr>
+            <w:r>
+              <w:rPr>
+                <w:rFonts w:ascii="Arial" w:cs="Arial" w:eastAsia="Arial" w:hAnsi="Arial"/>
+                <w:color w:val="1E293B"/>
+                <w:sz w:val="20"/>
+                <w:szCs w:val="20"/>
+              </w:rPr>
+              <w:t xml:space="preserve">0 9 * * * 或 every 3600000ms</w:t>
+            </w:r>
+          </w:p>
+        </w:tc>
+        <w:tc>
+          <w:tcPr>
+            <w:tcW w:type="dxa" w:w="3600"/>
+            <w:tcBorders>
+              <w:top w:val="single" w:color="CBD5E1" w:sz="1"/>
+              <w:left w:val="single" w:color="CBD5E1" w:sz="1"/>
+              <w:bottom w:val="single" w:color="CBD5E1" w:sz="1"/>
+              <w:right w:val="single" w:color="CBD5E1" w:sz="1"/>
+            </w:tcBorders>
+            <w:tcMar>
+              <w:top w:type="dxa" w:w="60"/>
+              <w:left w:type="dxa" w:w="120"/>
+              <w:bottom w:type="dxa" w:w="60"/>
+              <w:right w:type="dxa" w:w="120"/>
+            </w:tcMar>
+            <w:vAlign w:val="center"/>
+          </w:tcPr>
+          <w:p>
+            <w:pPr>
+              <w:spacing w:after="0"/>
+            </w:pPr>
+            <w:r>
+              <w:rPr>
+                <w:rFonts w:ascii="Arial" w:cs="Arial" w:eastAsia="Arial" w:hAnsi="Arial"/>
+                <w:color w:val="1E293B"/>
+                <w:sz w:val="20"/>
+                <w:szCs w:val="20"/>
+              </w:rPr>
+              <w:t xml:space="preserve">原始表达式 + 人类可读翻译 (“每天 9:00”)</w:t>
+            </w:r>
+          </w:p>
+        </w:tc>
+      </w:tr>
+      <w:tr>
+        <w:tc>
+          <w:tcPr>
+            <w:tcW w:type="dxa" w:w="2200"/>
+            <w:tcBorders>
+              <w:top w:val="single" w:color="CBD5E1" w:sz="1"/>
+              <w:left w:val="single" w:color="CBD5E1" w:sz="1"/>
+              <w:bottom w:val="single" w:color="CBD5E1" w:sz="1"/>
+              <w:right w:val="single" w:color="CBD5E1" w:sz="1"/>
+            </w:tcBorders>
+            <w:shd w:fill="F8FAFC" w:val="clear"/>
+            <w:tcMar>
+              <w:top w:type="dxa" w:w="60"/>
+              <w:left w:type="dxa" w:w="120"/>
+              <w:bottom w:type="dxa" w:w="60"/>
+              <w:right w:type="dxa" w:w="120"/>
+            </w:tcMar>
+            <w:vAlign w:val="center"/>
+          </w:tcPr>
+          <w:p>
+            <w:pPr>
+              <w:spacing w:after="0"/>
+            </w:pPr>
+            <w:r>
+              <w:rPr>
+                <w:rFonts w:ascii="Arial" w:cs="Arial" w:eastAsia="Arial" w:hAnsi="Arial"/>
+                <w:color w:val="1E293B"/>
+                <w:sz w:val="20"/>
+                <w:szCs w:val="20"/>
+              </w:rPr>
+              <w:t xml:space="preserve">时区</w:t>
+            </w:r>
+          </w:p>
+        </w:tc>
+        <w:tc>
+          <w:tcPr>
+            <w:tcW w:type="dxa" w:w="3560"/>
+            <w:tcBorders>
+              <w:top w:val="single" w:color="CBD5E1" w:sz="1"/>
+              <w:left w:val="single" w:color="CBD5E1" w:sz="1"/>
+              <w:bottom w:val="single" w:color="CBD5E1" w:sz="1"/>
+              <w:right w:val="single" w:color="CBD5E1" w:sz="1"/>
+            </w:tcBorders>
+            <w:shd w:fill="F8FAFC" w:val="clear"/>
+            <w:tcMar>
+              <w:top w:type="dxa" w:w="60"/>
+              <w:left w:type="dxa" w:w="120"/>
+              <w:bottom w:type="dxa" w:w="60"/>
+              <w:right w:type="dxa" w:w="120"/>
+            </w:tcMar>
+            <w:vAlign w:val="center"/>
+          </w:tcPr>
+          <w:p>
+            <w:pPr>
+              <w:spacing w:after="0"/>
+            </w:pPr>
+            <w:r>
+              <w:rPr>
+                <w:rFonts w:ascii="Arial" w:cs="Arial" w:eastAsia="Arial" w:hAnsi="Arial"/>
+                <w:color w:val="1E293B"/>
+                <w:sz w:val="20"/>
+                <w:szCs w:val="20"/>
+              </w:rPr>
+              <w:t xml:space="preserve">schedule.tz</w:t>
+            </w:r>
+          </w:p>
+        </w:tc>
+        <w:tc>
+          <w:tcPr>
+            <w:tcW w:type="dxa" w:w="3600"/>
+            <w:tcBorders>
+              <w:top w:val="single" w:color="CBD5E1" w:sz="1"/>
+              <w:left w:val="single" w:color="CBD5E1" w:sz="1"/>
+              <w:bottom w:val="single" w:color="CBD5E1" w:sz="1"/>
+              <w:right w:val="single" w:color="CBD5E1" w:sz="1"/>
+            </w:tcBorders>
+            <w:shd w:fill="F8FAFC" w:val="clear"/>
+            <w:tcMar>
+              <w:top w:type="dxa" w:w="60"/>
+              <w:left w:type="dxa" w:w="120"/>
+              <w:bottom w:type="dxa" w:w="60"/>
+              <w:right w:type="dxa" w:w="120"/>
+            </w:tcMar>
+            <w:vAlign w:val="center"/>
+          </w:tcPr>
+          <w:p>
+            <w:pPr>
+              <w:spacing w:after="0"/>
+            </w:pPr>
+            <w:r>
+              <w:rPr>
+                <w:rFonts w:ascii="Arial" w:cs="Arial" w:eastAsia="Arial" w:hAnsi="Arial"/>
+                <w:color w:val="1E293B"/>
+                <w:sz w:val="20"/>
+                <w:szCs w:val="20"/>
+              </w:rPr>
+              <w:t xml:space="preserve">如 America/Los_Angeles</w:t>
+            </w:r>
+          </w:p>
+        </w:tc>
+      </w:tr>
+      <w:tr>
+        <w:tc>
+          <w:tcPr>
+            <w:tcW w:type="dxa" w:w="2200"/>
+            <w:tcBorders>
+              <w:top w:val="single" w:color="CBD5E1" w:sz="1"/>
+              <w:left w:val="single" w:color="CBD5E1" w:sz="1"/>
+              <w:bottom w:val="single" w:color="CBD5E1" w:sz="1"/>
+              <w:right w:val="single" w:color="CBD5E1" w:sz="1"/>
+            </w:tcBorders>
+            <w:tcMar>
+              <w:top w:type="dxa" w:w="60"/>
+              <w:left w:type="dxa" w:w="120"/>
+              <w:bottom w:type="dxa" w:w="60"/>
+              <w:right w:type="dxa" w:w="120"/>
+            </w:tcMar>
+            <w:vAlign w:val="center"/>
+          </w:tcPr>
+          <w:p>
+            <w:pPr>
+              <w:spacing w:after="0"/>
+            </w:pPr>
+            <w:r>
+              <w:rPr>
+                <w:rFonts w:ascii="Arial" w:cs="Arial" w:eastAsia="Arial" w:hAnsi="Arial"/>
+                <w:color w:val="1E293B"/>
+                <w:sz w:val="20"/>
+                <w:szCs w:val="20"/>
+              </w:rPr>
+              <w:t xml:space="preserve">启用状态</w:t>
+            </w:r>
+          </w:p>
+        </w:tc>
+        <w:tc>
+          <w:tcPr>
+            <w:tcW w:type="dxa" w:w="3560"/>
+            <w:tcBorders>
+              <w:top w:val="single" w:color="CBD5E1" w:sz="1"/>
+              <w:left w:val="single" w:color="CBD5E1" w:sz="1"/>
+              <w:bottom w:val="single" w:color="CBD5E1" w:sz="1"/>
+              <w:right w:val="single" w:color="CBD5E1" w:sz="1"/>
+            </w:tcBorders>
+            <w:tcMar>
+              <w:top w:type="dxa" w:w="60"/>
+              <w:left w:type="dxa" w:w="120"/>
+              <w:bottom w:type="dxa" w:w="60"/>
+              <w:right w:type="dxa" w:w="120"/>
+            </w:tcMar>
+            <w:vAlign w:val="center"/>
+          </w:tcPr>
+          <w:p>
+            <w:pPr>
+              <w:spacing w:after="0"/>
+            </w:pPr>
+            <w:r>
+              <w:rPr>
+                <w:rFonts w:ascii="Arial" w:cs="Arial" w:eastAsia="Arial" w:hAnsi="Arial"/>
+                <w:color w:val="1E293B"/>
+                <w:sz w:val="20"/>
+                <w:szCs w:val="20"/>
+              </w:rPr>
+              <w:t xml:space="preserve">enabled: true/false</w:t>
+            </w:r>
+          </w:p>
+        </w:tc>
+        <w:tc>
+          <w:tcPr>
+            <w:tcW w:type="dxa" w:w="3600"/>
+            <w:tcBorders>
+              <w:top w:val="single" w:color="CBD5E1" w:sz="1"/>
+              <w:left w:val="single" w:color="CBD5E1" w:sz="1"/>
+              <w:bottom w:val="single" w:color="CBD5E1" w:sz="1"/>
+              <w:right w:val="single" w:color="CBD5E1" w:sz="1"/>
+            </w:tcBorders>
+            <w:tcMar>
+              <w:top w:type="dxa" w:w="60"/>
+              <w:left w:type="dxa" w:w="120"/>
+              <w:bottom w:type="dxa" w:w="60"/>
+              <w:right w:type="dxa" w:w="120"/>
+            </w:tcMar>
+            <w:vAlign w:val="center"/>
+          </w:tcPr>
+          <w:p>
+            <w:pPr>
+              <w:spacing w:after="0"/>
+            </w:pPr>
+            <w:r>
+              <w:rPr>
+                <w:rFonts w:ascii="Arial" w:cs="Arial" w:eastAsia="Arial" w:hAnsi="Arial"/>
+                <w:color w:val="1E293B"/>
+                <w:sz w:val="20"/>
+                <w:szCs w:val="20"/>
+              </w:rPr>
+              <w:t xml:space="preserve">绿色圆点 / 灰色圆点</w:t>
+            </w:r>
+          </w:p>
+        </w:tc>
+      </w:tr>
+      <w:tr>
+        <w:tc>
+          <w:tcPr>
+            <w:tcW w:type="dxa" w:w="2200"/>
+            <w:tcBorders>
+              <w:top w:val="single" w:color="CBD5E1" w:sz="1"/>
+              <w:left w:val="single" w:color="CBD5E1" w:sz="1"/>
+              <w:bottom w:val="single" w:color="CBD5E1" w:sz="1"/>
+              <w:right w:val="single" w:color="CBD5E1" w:sz="1"/>
+            </w:tcBorders>
+            <w:shd w:fill="F8FAFC" w:val="clear"/>
+            <w:tcMar>
+              <w:top w:type="dxa" w:w="60"/>
+              <w:left w:type="dxa" w:w="120"/>
+              <w:bottom w:type="dxa" w:w="60"/>
+              <w:right w:type="dxa" w:w="120"/>
+            </w:tcMar>
+            <w:vAlign w:val="center"/>
+          </w:tcPr>
+          <w:p>
+            <w:pPr>
+              <w:spacing w:after="0"/>
+            </w:pPr>
+            <w:r>
+              <w:rPr>
+                <w:rFonts w:ascii="Arial" w:cs="Arial" w:eastAsia="Arial" w:hAnsi="Arial"/>
+                <w:color w:val="1E293B"/>
+                <w:sz w:val="20"/>
+                <w:szCs w:val="20"/>
+              </w:rPr>
+              <w:t xml:space="preserve">上次运行</w:t>
+            </w:r>
+          </w:p>
+        </w:tc>
+        <w:tc>
+          <w:tcPr>
+            <w:tcW w:type="dxa" w:w="3560"/>
+            <w:tcBorders>
+              <w:top w:val="single" w:color="CBD5E1" w:sz="1"/>
+              <w:left w:val="single" w:color="CBD5E1" w:sz="1"/>
+              <w:bottom w:val="single" w:color="CBD5E1" w:sz="1"/>
+              <w:right w:val="single" w:color="CBD5E1" w:sz="1"/>
+            </w:tcBorders>
+            <w:shd w:fill="F8FAFC" w:val="clear"/>
+            <w:tcMar>
+              <w:top w:type="dxa" w:w="60"/>
+              <w:left w:type="dxa" w:w="120"/>
+              <w:bottom w:type="dxa" w:w="60"/>
+              <w:right w:type="dxa" w:w="120"/>
+            </w:tcMar>
+            <w:vAlign w:val="center"/>
+          </w:tcPr>
+          <w:p>
+            <w:pPr>
+              <w:spacing w:after="0"/>
+            </w:pPr>
+            <w:r>
+              <w:rPr>
+                <w:rFonts w:ascii="Arial" w:cs="Arial" w:eastAsia="Arial" w:hAnsi="Arial"/>
+                <w:color w:val="1E293B"/>
+                <w:sz w:val="20"/>
+                <w:szCs w:val="20"/>
+              </w:rPr>
+              <w:t xml:space="preserve">lastRun 时间戳</w:t>
+            </w:r>
+          </w:p>
+        </w:tc>
+        <w:tc>
+          <w:tcPr>
+            <w:tcW w:type="dxa" w:w="3600"/>
+            <w:tcBorders>
+              <w:top w:val="single" w:color="CBD5E1" w:sz="1"/>
+              <w:left w:val="single" w:color="CBD5E1" w:sz="1"/>
+              <w:bottom w:val="single" w:color="CBD5E1" w:sz="1"/>
+              <w:right w:val="single" w:color="CBD5E1" w:sz="1"/>
+            </w:tcBorders>
+            <w:shd w:fill="F8FAFC" w:val="clear"/>
+            <w:tcMar>
+              <w:top w:type="dxa" w:w="60"/>
+              <w:left w:type="dxa" w:w="120"/>
+              <w:bottom w:type="dxa" w:w="60"/>
+              <w:right w:type="dxa" w:w="120"/>
+            </w:tcMar>
+            <w:vAlign w:val="center"/>
+          </w:tcPr>
+          <w:p>
+            <w:pPr>
+              <w:spacing w:after="0"/>
+            </w:pPr>
+            <w:r>
+              <w:rPr>
+                <w:rFonts w:ascii="Arial" w:cs="Arial" w:eastAsia="Arial" w:hAnsi="Arial"/>
+                <w:color w:val="1E293B"/>
+                <w:sz w:val="20"/>
+                <w:szCs w:val="20"/>
+              </w:rPr>
+              <w:t xml:space="preserve">RelativeDateTimeFormatter</w:t>
+            </w:r>
+          </w:p>
+        </w:tc>
+      </w:tr>
+      <w:tr>
+        <w:tc>
+          <w:tcPr>
+            <w:tcW w:type="dxa" w:w="2200"/>
+            <w:tcBorders>
+              <w:top w:val="single" w:color="CBD5E1" w:sz="1"/>
+              <w:left w:val="single" w:color="CBD5E1" w:sz="1"/>
+              <w:bottom w:val="single" w:color="CBD5E1" w:sz="1"/>
+              <w:right w:val="single" w:color="CBD5E1" w:sz="1"/>
+            </w:tcBorders>
+            <w:tcMar>
+              <w:top w:type="dxa" w:w="60"/>
+              <w:left w:type="dxa" w:w="120"/>
+              <w:bottom w:type="dxa" w:w="60"/>
+              <w:right w:type="dxa" w:w="120"/>
+            </w:tcMar>
+            <w:vAlign w:val="center"/>
+          </w:tcPr>
+          <w:p>
+            <w:pPr>
+              <w:spacing w:after="0"/>
+            </w:pPr>
+            <w:r>
+              <w:rPr>
+                <w:rFonts w:ascii="Arial" w:cs="Arial" w:eastAsia="Arial" w:hAnsi="Arial"/>
+                <w:color w:val="1E293B"/>
+                <w:sz w:val="20"/>
+                <w:szCs w:val="20"/>
+              </w:rPr>
+              <w:t xml:space="preserve">上次结果</w:t>
+            </w:r>
+          </w:p>
+        </w:tc>
+        <w:tc>
+          <w:tcPr>
+            <w:tcW w:type="dxa" w:w="3560"/>
+            <w:tcBorders>
+              <w:top w:val="single" w:color="CBD5E1" w:sz="1"/>
+              <w:left w:val="single" w:color="CBD5E1" w:sz="1"/>
+              <w:bottom w:val="single" w:color="CBD5E1" w:sz="1"/>
+              <w:right w:val="single" w:color="CBD5E1" w:sz="1"/>
+            </w:tcBorders>
+            <w:tcMar>
+              <w:top w:type="dxa" w:w="60"/>
+              <w:left w:type="dxa" w:w="120"/>
+              <w:bottom w:type="dxa" w:w="60"/>
+              <w:right w:type="dxa" w:w="120"/>
+            </w:tcMar>
+            <w:vAlign w:val="center"/>
+          </w:tcPr>
+          <w:p>
+            <w:pPr>
+              <w:spacing w:after="0"/>
+            </w:pPr>
+            <w:r>
+              <w:rPr>
+                <w:rFonts w:ascii="Arial" w:cs="Arial" w:eastAsia="Arial" w:hAnsi="Arial"/>
+                <w:color w:val="1E293B"/>
+                <w:sz w:val="20"/>
+                <w:szCs w:val="20"/>
+              </w:rPr>
+              <w:t xml:space="preserve">lastRun status</w:t>
+            </w:r>
+          </w:p>
+        </w:tc>
+        <w:tc>
+          <w:tcPr>
+            <w:tcW w:type="dxa" w:w="3600"/>
+            <w:tcBorders>
+              <w:top w:val="single" w:color="CBD5E1" w:sz="1"/>
+              <w:left w:val="single" w:color="CBD5E1" w:sz="1"/>
+              <w:bottom w:val="single" w:color="CBD5E1" w:sz="1"/>
+              <w:right w:val="single" w:color="CBD5E1" w:sz="1"/>
+            </w:tcBorders>
+            <w:tcMar>
+              <w:top w:type="dxa" w:w="60"/>
+              <w:left w:type="dxa" w:w="120"/>
+              <w:bottom w:type="dxa" w:w="60"/>
+              <w:right w:type="dxa" w:w="120"/>
+            </w:tcMar>
+            <w:vAlign w:val="center"/>
+          </w:tcPr>
+          <w:p>
+            <w:pPr>
+              <w:spacing w:after="0"/>
+            </w:pPr>
+            <w:r>
+              <w:rPr>
+                <w:rFonts w:ascii="Arial" w:cs="Arial" w:eastAsia="Arial" w:hAnsi="Arial"/>
+                <w:color w:val="1E293B"/>
+                <w:sz w:val="20"/>
+                <w:szCs w:val="20"/>
+              </w:rPr>
+              <w:t xml:space="preserve">✅ ok / ❌ failed</w:t>
+            </w:r>
+          </w:p>
+        </w:tc>
+      </w:tr>
+      <w:tr>
+        <w:tc>
+          <w:tcPr>
+            <w:tcW w:type="dxa" w:w="2200"/>
+            <w:tcBorders>
+              <w:top w:val="single" w:color="CBD5E1" w:sz="1"/>
+              <w:left w:val="single" w:color="CBD5E1" w:sz="1"/>
+              <w:bottom w:val="single" w:color="CBD5E1" w:sz="1"/>
+              <w:right w:val="single" w:color="CBD5E1" w:sz="1"/>
+            </w:tcBorders>
+            <w:shd w:fill="F8FAFC" w:val="clear"/>
+            <w:tcMar>
+              <w:top w:type="dxa" w:w="60"/>
+              <w:left w:type="dxa" w:w="120"/>
+              <w:bottom w:type="dxa" w:w="60"/>
+              <w:right w:type="dxa" w:w="120"/>
+            </w:tcMar>
+            <w:vAlign w:val="center"/>
+          </w:tcPr>
+          <w:p>
+            <w:pPr>
+              <w:spacing w:after="0"/>
+            </w:pPr>
+            <w:r>
+              <w:rPr>
+                <w:rFonts w:ascii="Arial" w:cs="Arial" w:eastAsia="Arial" w:hAnsi="Arial"/>
+                <w:color w:val="1E293B"/>
+                <w:sz w:val="20"/>
+                <w:szCs w:val="20"/>
+              </w:rPr>
+              <w:t xml:space="preserve">下次运行</w:t>
+            </w:r>
+          </w:p>
+        </w:tc>
+        <w:tc>
+          <w:tcPr>
+            <w:tcW w:type="dxa" w:w="3560"/>
+            <w:tcBorders>
+              <w:top w:val="single" w:color="CBD5E1" w:sz="1"/>
+              <w:left w:val="single" w:color="CBD5E1" w:sz="1"/>
+              <w:bottom w:val="single" w:color="CBD5E1" w:sz="1"/>
+              <w:right w:val="single" w:color="CBD5E1" w:sz="1"/>
+            </w:tcBorders>
+            <w:shd w:fill="F8FAFC" w:val="clear"/>
+            <w:tcMar>
+              <w:top w:type="dxa" w:w="60"/>
+              <w:left w:type="dxa" w:w="120"/>
+              <w:bottom w:type="dxa" w:w="60"/>
+              <w:right w:type="dxa" w:w="120"/>
+            </w:tcMar>
+            <w:vAlign w:val="center"/>
+          </w:tcPr>
+          <w:p>
+            <w:pPr>
+              <w:spacing w:after="0"/>
+            </w:pPr>
+            <w:r>
+              <w:rPr>
+                <w:rFonts w:ascii="Arial" w:cs="Arial" w:eastAsia="Arial" w:hAnsi="Arial"/>
+                <w:color w:val="1E293B"/>
+                <w:sz w:val="20"/>
+                <w:szCs w:val="20"/>
+              </w:rPr>
+              <w:t xml:space="preserve">根据 schedule 计算</w:t>
+            </w:r>
+          </w:p>
+        </w:tc>
+        <w:tc>
+          <w:tcPr>
+            <w:tcW w:type="dxa" w:w="3600"/>
+            <w:tcBorders>
+              <w:top w:val="single" w:color="CBD5E1" w:sz="1"/>
+              <w:left w:val="single" w:color="CBD5E1" w:sz="1"/>
+              <w:bottom w:val="single" w:color="CBD5E1" w:sz="1"/>
+              <w:right w:val="single" w:color="CBD5E1" w:sz="1"/>
+            </w:tcBorders>
+            <w:shd w:fill="F8FAFC" w:val="clear"/>
+            <w:tcMar>
+              <w:top w:type="dxa" w:w="60"/>
+              <w:left w:type="dxa" w:w="120"/>
+              <w:bottom w:type="dxa" w:w="60"/>
+              <w:right w:type="dxa" w:w="120"/>
+            </w:tcMar>
+            <w:vAlign w:val="center"/>
+          </w:tcPr>
+          <w:p>
+            <w:pPr>
+              <w:spacing w:after="0"/>
+            </w:pPr>
+            <w:r>
+              <w:rPr>
+                <w:rFonts w:ascii="Arial" w:cs="Arial" w:eastAsia="Arial" w:hAnsi="Arial"/>
+                <w:color w:val="1E293B"/>
+                <w:sz w:val="20"/>
+                <w:szCs w:val="20"/>
+              </w:rPr>
+              <w:t xml:space="preserve">预计时间</w:t>
+            </w:r>
+          </w:p>
+        </w:tc>
+      </w:tr>
+      <w:tr>
+        <w:tc>
+          <w:tcPr>
+            <w:tcW w:type="dxa" w:w="2200"/>
+            <w:tcBorders>
+              <w:top w:val="single" w:color="CBD5E1" w:sz="1"/>
+              <w:left w:val="single" w:color="CBD5E1" w:sz="1"/>
+              <w:bottom w:val="single" w:color="CBD5E1" w:sz="1"/>
+              <w:right w:val="single" w:color="CBD5E1" w:sz="1"/>
+            </w:tcBorders>
+            <w:tcMar>
+              <w:top w:type="dxa" w:w="60"/>
+              <w:left w:type="dxa" w:w="120"/>
+              <w:bottom w:type="dxa" w:w="60"/>
+              <w:right w:type="dxa" w:w="120"/>
+            </w:tcMar>
+            <w:vAlign w:val="center"/>
+          </w:tcPr>
+          <w:p>
+            <w:pPr>
+              <w:spacing w:after="0"/>
+            </w:pPr>
+            <w:r>
+              <w:rPr>
+                <w:rFonts w:ascii="Arial" w:cs="Arial" w:eastAsia="Arial" w:hAnsi="Arial"/>
+                <w:color w:val="1E293B"/>
+                <w:sz w:val="20"/>
+                <w:szCs w:val="20"/>
+              </w:rPr>
+              <w:t xml:space="preserve">目标 Session</w:t>
+            </w:r>
+          </w:p>
+        </w:tc>
+        <w:tc>
+          <w:tcPr>
+            <w:tcW w:type="dxa" w:w="3560"/>
+            <w:tcBorders>
+              <w:top w:val="single" w:color="CBD5E1" w:sz="1"/>
+              <w:left w:val="single" w:color="CBD5E1" w:sz="1"/>
+              <w:bottom w:val="single" w:color="CBD5E1" w:sz="1"/>
+              <w:right w:val="single" w:color="CBD5E1" w:sz="1"/>
+            </w:tcBorders>
+            <w:tcMar>
+              <w:top w:type="dxa" w:w="60"/>
+              <w:left w:type="dxa" w:w="120"/>
+              <w:bottom w:type="dxa" w:w="60"/>
+              <w:right w:type="dxa" w:w="120"/>
+            </w:tcMar>
+            <w:vAlign w:val="center"/>
+          </w:tcPr>
+          <w:p>
+            <w:pPr>
+              <w:spacing w:after="0"/>
+            </w:pPr>
+            <w:r>
+              <w:rPr>
+                <w:rFonts w:ascii="Arial" w:cs="Arial" w:eastAsia="Arial" w:hAnsi="Arial"/>
+                <w:color w:val="1E293B"/>
+                <w:sz w:val="20"/>
+                <w:szCs w:val="20"/>
+              </w:rPr>
+              <w:t xml:space="preserve">sessionTarget</w:t>
+            </w:r>
+          </w:p>
+        </w:tc>
+        <w:tc>
+          <w:tcPr>
+            <w:tcW w:type="dxa" w:w="3600"/>
+            <w:tcBorders>
+              <w:top w:val="single" w:color="CBD5E1" w:sz="1"/>
+              <w:left w:val="single" w:color="CBD5E1" w:sz="1"/>
+              <w:bottom w:val="single" w:color="CBD5E1" w:sz="1"/>
+              <w:right w:val="single" w:color="CBD5E1" w:sz="1"/>
+            </w:tcBorders>
+            <w:tcMar>
+              <w:top w:type="dxa" w:w="60"/>
+              <w:left w:type="dxa" w:w="120"/>
+              <w:bottom w:type="dxa" w:w="60"/>
+              <w:right w:type="dxa" w:w="120"/>
+            </w:tcMar>
+            <w:vAlign w:val="center"/>
+          </w:tcPr>
+          <w:p>
+            <w:pPr>
+              <w:spacing w:after="0"/>
+            </w:pPr>
+            <w:r>
+              <w:rPr>
+                <w:rFonts w:ascii="Arial" w:cs="Arial" w:eastAsia="Arial" w:hAnsi="Arial"/>
+                <w:color w:val="1E293B"/>
+                <w:sz w:val="20"/>
+                <w:szCs w:val="20"/>
+              </w:rPr>
+              <w:t xml:space="preserve">main / isolated / custom</w:t>
+            </w:r>
+          </w:p>
+        </w:tc>
+      </w:tr>
+      <w:tr>
+        <w:tc>
+          <w:tcPr>
+            <w:tcW w:type="dxa" w:w="2200"/>
+            <w:tcBorders>
+              <w:top w:val="single" w:color="CBD5E1" w:sz="1"/>
+              <w:left w:val="single" w:color="CBD5E1" w:sz="1"/>
+              <w:bottom w:val="single" w:color="CBD5E1" w:sz="1"/>
+              <w:right w:val="single" w:color="CBD5E1" w:sz="1"/>
+            </w:tcBorders>
+            <w:shd w:fill="F8FAFC" w:val="clear"/>
+            <w:tcMar>
+              <w:top w:type="dxa" w:w="60"/>
+              <w:left w:type="dxa" w:w="120"/>
+              <w:bottom w:type="dxa" w:w="60"/>
+              <w:right w:type="dxa" w:w="120"/>
+            </w:tcMar>
+            <w:vAlign w:val="center"/>
+          </w:tcPr>
+          <w:p>
+            <w:pPr>
+              <w:spacing w:after="0"/>
+            </w:pPr>
+            <w:r>
+              <w:rPr>
+                <w:rFonts w:ascii="Arial" w:cs="Arial" w:eastAsia="Arial" w:hAnsi="Arial"/>
+                <w:color w:val="1E293B"/>
+                <w:sz w:val="20"/>
+                <w:szCs w:val="20"/>
+              </w:rPr>
+              <w:t xml:space="preserve">模型覆盖</w:t>
+            </w:r>
+          </w:p>
+        </w:tc>
+        <w:tc>
+          <w:tcPr>
+            <w:tcW w:type="dxa" w:w="3560"/>
+            <w:tcBorders>
+              <w:top w:val="single" w:color="CBD5E1" w:sz="1"/>
+              <w:left w:val="single" w:color="CBD5E1" w:sz="1"/>
+              <w:bottom w:val="single" w:color="CBD5E1" w:sz="1"/>
+              <w:right w:val="single" w:color="CBD5E1" w:sz="1"/>
+            </w:tcBorders>
+            <w:shd w:fill="F8FAFC" w:val="clear"/>
+            <w:tcMar>
+              <w:top w:type="dxa" w:w="60"/>
+              <w:left w:type="dxa" w:w="120"/>
+              <w:bottom w:type="dxa" w:w="60"/>
+              <w:right w:type="dxa" w:w="120"/>
+            </w:tcMar>
+            <w:vAlign w:val="center"/>
+          </w:tcPr>
+          <w:p>
+            <w:pPr>
+              <w:spacing w:after="0"/>
+            </w:pPr>
+            <w:r>
+              <w:rPr>
+                <w:rFonts w:ascii="Arial" w:cs="Arial" w:eastAsia="Arial" w:hAnsi="Arial"/>
+                <w:color w:val="1E293B"/>
+                <w:sz w:val="20"/>
+                <w:szCs w:val="20"/>
+              </w:rPr>
+              <w:t xml:space="preserve">model (if set)</w:t>
+            </w:r>
+          </w:p>
+        </w:tc>
+        <w:tc>
+          <w:tcPr>
+            <w:tcW w:type="dxa" w:w="3600"/>
+            <w:tcBorders>
+              <w:top w:val="single" w:color="CBD5E1" w:sz="1"/>
+              <w:left w:val="single" w:color="CBD5E1" w:sz="1"/>
+              <w:bottom w:val="single" w:color="CBD5E1" w:sz="1"/>
+              <w:right w:val="single" w:color="CBD5E1" w:sz="1"/>
+            </w:tcBorders>
+            <w:shd w:fill="F8FAFC" w:val="clear"/>
+            <w:tcMar>
+              <w:top w:type="dxa" w:w="60"/>
+              <w:left w:type="dxa" w:w="120"/>
+              <w:bottom w:type="dxa" w:w="60"/>
+              <w:right w:type="dxa" w:w="120"/>
+            </w:tcMar>
+            <w:vAlign w:val="center"/>
+          </w:tcPr>
+          <w:p>
+            <w:pPr>
+              <w:spacing w:after="0"/>
+            </w:pPr>
+            <w:r>
+              <w:rPr>
+                <w:rFonts w:ascii="Arial" w:cs="Arial" w:eastAsia="Arial" w:hAnsi="Arial"/>
+                <w:color w:val="1E293B"/>
+                <w:sz w:val="20"/>
+                <w:szCs w:val="20"/>
+              </w:rPr>
+              <w:t xml:space="preserve">显示模型名，未设置则显示 “默认”</w:t>
+            </w:r>
+          </w:p>
+        </w:tc>
+      </w:tr>
+      <w:tr>
+        <w:tc>
+          <w:tcPr>
+            <w:tcW w:type="dxa" w:w="2200"/>
+            <w:tcBorders>
+              <w:top w:val="single" w:color="CBD5E1" w:sz="1"/>
+              <w:left w:val="single" w:color="CBD5E1" w:sz="1"/>
+              <w:bottom w:val="single" w:color="CBD5E1" w:sz="1"/>
+              <w:right w:val="single" w:color="CBD5E1" w:sz="1"/>
+            </w:tcBorders>
+            <w:tcMar>
+              <w:top w:type="dxa" w:w="60"/>
+              <w:left w:type="dxa" w:w="120"/>
+              <w:bottom w:type="dxa" w:w="60"/>
+              <w:right w:type="dxa" w:w="120"/>
+            </w:tcMar>
+            <w:vAlign w:val="center"/>
+          </w:tcPr>
+          <w:p>
+            <w:pPr>
+              <w:spacing w:after="0"/>
+            </w:pPr>
+            <w:r>
+              <w:rPr>
+                <w:rFonts w:ascii="Arial" w:cs="Arial" w:eastAsia="Arial" w:hAnsi="Arial"/>
+                <w:color w:val="1E293B"/>
+                <w:sz w:val="20"/>
+                <w:szCs w:val="20"/>
+              </w:rPr>
+              <w:t xml:space="preserve">投递渠道</w:t>
+            </w:r>
+          </w:p>
+        </w:tc>
+        <w:tc>
+          <w:tcPr>
+            <w:tcW w:type="dxa" w:w="3560"/>
+            <w:tcBorders>
+              <w:top w:val="single" w:color="CBD5E1" w:sz="1"/>
+              <w:left w:val="single" w:color="CBD5E1" w:sz="1"/>
+              <w:bottom w:val="single" w:color="CBD5E1" w:sz="1"/>
+              <w:right w:val="single" w:color="CBD5E1" w:sz="1"/>
+            </w:tcBorders>
+            <w:tcMar>
+              <w:top w:type="dxa" w:w="60"/>
+              <w:left w:type="dxa" w:w="120"/>
+              <w:bottom w:type="dxa" w:w="60"/>
+              <w:right w:type="dxa" w:w="120"/>
+            </w:tcMar>
+            <w:vAlign w:val="center"/>
+          </w:tcPr>
+          <w:p>
+            <w:pPr>
+              <w:spacing w:after="0"/>
+            </w:pPr>
+            <w:r>
+              <w:rPr>
+                <w:rFonts w:ascii="Arial" w:cs="Arial" w:eastAsia="Arial" w:hAnsi="Arial"/>
+                <w:color w:val="1E293B"/>
+                <w:sz w:val="20"/>
+                <w:szCs w:val="20"/>
+              </w:rPr>
+              <w:t xml:space="preserve">delivery.channel + to</w:t>
+            </w:r>
+          </w:p>
+        </w:tc>
+        <w:tc>
+          <w:tcPr>
+            <w:tcW w:type="dxa" w:w="3600"/>
+            <w:tcBorders>
+              <w:top w:val="single" w:color="CBD5E1" w:sz="1"/>
+              <w:left w:val="single" w:color="CBD5E1" w:sz="1"/>
+              <w:bottom w:val="single" w:color="CBD5E1" w:sz="1"/>
+              <w:right w:val="single" w:color="CBD5E1" w:sz="1"/>
+            </w:tcBorders>
+            <w:tcMar>
+              <w:top w:type="dxa" w:w="60"/>
+              <w:left w:type="dxa" w:w="120"/>
+              <w:bottom w:type="dxa" w:w="60"/>
+              <w:right w:type="dxa" w:w="120"/>
+            </w:tcMar>
+            <w:vAlign w:val="center"/>
+          </w:tcPr>
+          <w:p>
+            <w:pPr>
+              <w:spacing w:after="0"/>
+            </w:pPr>
+            <w:r>
+              <w:rPr>
+                <w:rFonts w:ascii="Arial" w:cs="Arial" w:eastAsia="Arial" w:hAnsi="Arial"/>
+                <w:color w:val="1E293B"/>
+                <w:sz w:val="20"/>
+                <w:szCs w:val="20"/>
+              </w:rPr>
+              <w:t xml:space="preserve">如 “Telegram: @user”</w:t>
+            </w:r>
+          </w:p>
+        </w:tc>
+      </w:tr>
+    </w:tbl>
+    <w:p>
+      <w:pPr>
+        <w:pStyle w:val="Heading3"/>
+      </w:pPr>
+      <w:r>
+        <w:t xml:space="preserve">3.12.3 快捷操作</w:t>
+      </w:r>
+    </w:p>
+    <w:p>
+      <w:pPr>
+        <w:spacing w:after="160" w:line="320"/>
+      </w:pPr>
+      <w:r>
+        <w:rPr>
+          <w:rFonts w:ascii="Arial" w:cs="Arial" w:eastAsia="Arial" w:hAnsi="Arial"/>
+          <w:color w:val="1E293B"/>
+          <w:sz w:val="22"/>
+          <w:szCs w:val="22"/>
+        </w:rPr>
+        <w:t xml:space="preserve">以下操作通过 CLI 命令执行，不直接编辑 jobs.json：</w:t>
+      </w:r>
+    </w:p>
+    <w:tbl>
+      <w:tblPr>
+        <w:tblW w:type="dxa" w:w="9360"/>
+        <w:tblBorders>
+          <w:top w:val="single" w:color="auto" w:sz="4"/>
+          <w:left w:val="single" w:color="auto" w:sz="4"/>
+          <w:bottom w:val="single" w:color="auto" w:sz="4"/>
+          <w:right w:val="single" w:color="auto" w:sz="4"/>
+          <w:insideH w:val="single" w:color="auto" w:sz="4"/>
+          <w:insideV w:val="single" w:color="auto" w:sz="4"/>
+        </w:tblBorders>
+      </w:tblPr>
+      <w:tblGrid>
+        <w:gridCol w:w="2200"/>
+        <w:gridCol w:w="4560"/>
+        <w:gridCol w:w="2600"/>
+      </w:tblGrid>
+      <w:tr>
+        <w:trPr>
+          <w:tblHeader/>
+        </w:trPr>
+        <w:tc>
+          <w:tcPr>
+            <w:tcW w:type="dxa" w:w="2200"/>
+            <w:tcBorders>
+              <w:top w:val="single" w:color="CBD5E1" w:sz="1"/>
+              <w:left w:val="single" w:color="CBD5E1" w:sz="1"/>
+              <w:bottom w:val="single" w:color="CBD5E1" w:sz="1"/>
+              <w:right w:val="single" w:color="CBD5E1" w:sz="1"/>
+            </w:tcBorders>
+            <w:shd w:fill="1E40AF" w:val="clear"/>
+            <w:tcMar>
+              <w:top w:type="dxa" w:w="60"/>
+              <w:left w:type="dxa" w:w="120"/>
+              <w:bottom w:type="dxa" w:w="60"/>
+              <w:right w:type="dxa" w:w="120"/>
+            </w:tcMar>
+            <w:vAlign w:val="center"/>
+          </w:tcPr>
+          <w:p>
+            <w:pPr>
+              <w:spacing w:after="0"/>
+            </w:pPr>
+            <w:r>
+              <w:rPr>
+                <w:rFonts w:ascii="Arial" w:cs="Arial" w:eastAsia="Arial" w:hAnsi="Arial"/>
+                <w:b/>
+                <w:bCs/>
+                <w:color w:val="FFFFFF"/>
+                <w:sz w:val="20"/>
+                <w:szCs w:val="20"/>
+              </w:rPr>
+              <w:t xml:space="preserve">操作</w:t>
+            </w:r>
+          </w:p>
+        </w:tc>
+        <w:tc>
+          <w:tcPr>
+            <w:tcW w:type="dxa" w:w="4560"/>
+            <w:tcBorders>
+              <w:top w:val="single" w:color="CBD5E1" w:sz="1"/>
+              <w:left w:val="single" w:color="CBD5E1" w:sz="1"/>
+              <w:bottom w:val="single" w:color="CBD5E1" w:sz="1"/>
+              <w:right w:val="single" w:color="CBD5E1" w:sz="1"/>
+            </w:tcBorders>
+            <w:shd w:fill="1E40AF" w:val="clear"/>
+            <w:tcMar>
+              <w:top w:type="dxa" w:w="60"/>
+              <w:left w:type="dxa" w:w="120"/>
+              <w:bottom w:type="dxa" w:w="60"/>
+              <w:right w:type="dxa" w:w="120"/>
+            </w:tcMar>
+            <w:vAlign w:val="center"/>
+          </w:tcPr>
+          <w:p>
+            <w:pPr>
+              <w:spacing w:after="0"/>
+            </w:pPr>
+            <w:r>
+              <w:rPr>
+                <w:rFonts w:ascii="Arial" w:cs="Arial" w:eastAsia="Arial" w:hAnsi="Arial"/>
+                <w:b/>
+                <w:bCs/>
+                <w:color w:val="FFFFFF"/>
+                <w:sz w:val="20"/>
+                <w:szCs w:val="20"/>
+              </w:rPr>
+              <w:t xml:space="preserve">CLI 命令</w:t>
+            </w:r>
+          </w:p>
+        </w:tc>
+        <w:tc>
+          <w:tcPr>
+            <w:tcW w:type="dxa" w:w="2600"/>
+            <w:tcBorders>
+              <w:top w:val="single" w:color="CBD5E1" w:sz="1"/>
+              <w:left w:val="single" w:color="CBD5E1" w:sz="1"/>
+              <w:bottom w:val="single" w:color="CBD5E1" w:sz="1"/>
+              <w:right w:val="single" w:color="CBD5E1" w:sz="1"/>
+            </w:tcBorders>
+            <w:shd w:fill="1E40AF" w:val="clear"/>
+            <w:tcMar>
+              <w:top w:type="dxa" w:w="60"/>
+              <w:left w:type="dxa" w:w="120"/>
+              <w:bottom w:type="dxa" w:w="60"/>
+              <w:right w:type="dxa" w:w="120"/>
+            </w:tcMar>
+            <w:vAlign w:val="center"/>
+          </w:tcPr>
+          <w:p>
+            <w:pPr>
+              <w:spacing w:after="0"/>
+            </w:pPr>
+            <w:r>
+              <w:rPr>
+                <w:rFonts w:ascii="Arial" w:cs="Arial" w:eastAsia="Arial" w:hAnsi="Arial"/>
+                <w:b/>
+                <w:bCs/>
+                <w:color w:val="FFFFFF"/>
+                <w:sz w:val="20"/>
+                <w:szCs w:val="20"/>
+              </w:rPr>
+              <w:t xml:space="preserve">说明</w:t>
+            </w:r>
+          </w:p>
+        </w:tc>
+      </w:tr>
+      <w:tr>
+        <w:tc>
+          <w:tcPr>
+            <w:tcW w:type="dxa" w:w="2200"/>
+            <w:tcBorders>
+              <w:top w:val="single" w:color="CBD5E1" w:sz="1"/>
+              <w:left w:val="single" w:color="CBD5E1" w:sz="1"/>
+              <w:bottom w:val="single" w:color="CBD5E1" w:sz="1"/>
+              <w:right w:val="single" w:color="CBD5E1" w:sz="1"/>
+            </w:tcBorders>
+            <w:tcMar>
+              <w:top w:type="dxa" w:w="60"/>
+              <w:left w:type="dxa" w:w="120"/>
+              <w:bottom w:type="dxa" w:w="60"/>
+              <w:right w:type="dxa" w:w="120"/>
+            </w:tcMar>
+            <w:vAlign w:val="center"/>
+          </w:tcPr>
+          <w:p>
+            <w:pPr>
+              <w:spacing w:after="0"/>
+            </w:pPr>
+            <w:r>
+              <w:rPr>
+                <w:rFonts w:ascii="Arial" w:cs="Arial" w:eastAsia="Arial" w:hAnsi="Arial"/>
+                <w:color w:val="1E293B"/>
+                <w:sz w:val="20"/>
+                <w:szCs w:val="20"/>
+              </w:rPr>
+              <w:t xml:space="preserve">启用任务</w:t>
+            </w:r>
+          </w:p>
+        </w:tc>
+        <w:tc>
+          <w:tcPr>
+            <w:tcW w:type="dxa" w:w="4560"/>
+            <w:tcBorders>
+              <w:top w:val="single" w:color="CBD5E1" w:sz="1"/>
+              <w:left w:val="single" w:color="CBD5E1" w:sz="1"/>
+              <w:bottom w:val="single" w:color="CBD5E1" w:sz="1"/>
+              <w:right w:val="single" w:color="CBD5E1" w:sz="1"/>
+            </w:tcBorders>
+            <w:tcMar>
+              <w:top w:type="dxa" w:w="60"/>
+              <w:left w:type="dxa" w:w="120"/>
+              <w:bottom w:type="dxa" w:w="60"/>
+              <w:right w:type="dxa" w:w="120"/>
+            </w:tcMar>
+            <w:vAlign w:val="center"/>
+          </w:tcPr>
+          <w:p>
+            <w:pPr>
+              <w:spacing w:after="0"/>
+            </w:pPr>
+            <w:r>
+              <w:rPr>
+                <w:rFonts w:ascii="Arial" w:cs="Arial" w:eastAsia="Arial" w:hAnsi="Arial"/>
+                <w:color w:val="1E293B"/>
+                <w:sz w:val="20"/>
+                <w:szCs w:val="20"/>
+              </w:rPr>
+              <w:t xml:space="preserve">openclaw cron enable &lt;jobId&gt;</w:t>
+            </w:r>
+          </w:p>
+        </w:tc>
+        <w:tc>
+          <w:tcPr>
+            <w:tcW w:type="dxa" w:w="2600"/>
+            <w:tcBorders>
+              <w:top w:val="single" w:color="CBD5E1" w:sz="1"/>
+              <w:left w:val="single" w:color="CBD5E1" w:sz="1"/>
+              <w:bottom w:val="single" w:color="CBD5E1" w:sz="1"/>
+              <w:right w:val="single" w:color="CBD5E1" w:sz="1"/>
+            </w:tcBorders>
+            <w:tcMar>
+              <w:top w:type="dxa" w:w="60"/>
+              <w:left w:type="dxa" w:w="120"/>
+              <w:bottom w:type="dxa" w:w="60"/>
+              <w:right w:type="dxa" w:w="120"/>
+            </w:tcMar>
+            <w:vAlign w:val="center"/>
+          </w:tcPr>
+          <w:p>
+            <w:pPr>
+              <w:spacing w:after="0"/>
+            </w:pPr>
+            <w:r>
+              <w:rPr>
+                <w:rFonts w:ascii="Arial" w:cs="Arial" w:eastAsia="Arial" w:hAnsi="Arial"/>
+                <w:color w:val="1E293B"/>
+                <w:sz w:val="20"/>
+                <w:szCs w:val="20"/>
+              </w:rPr>
+              <w:t xml:space="preserve">将禁用的任务重新启用</w:t>
+            </w:r>
+          </w:p>
+        </w:tc>
+      </w:tr>
+      <w:tr>
+        <w:tc>
+          <w:tcPr>
+            <w:tcW w:type="dxa" w:w="2200"/>
+            <w:tcBorders>
+              <w:top w:val="single" w:color="CBD5E1" w:sz="1"/>
+              <w:left w:val="single" w:color="CBD5E1" w:sz="1"/>
+              <w:bottom w:val="single" w:color="CBD5E1" w:sz="1"/>
+              <w:right w:val="single" w:color="CBD5E1" w:sz="1"/>
+            </w:tcBorders>
+            <w:shd w:fill="F8FAFC" w:val="clear"/>
+            <w:tcMar>
+              <w:top w:type="dxa" w:w="60"/>
+              <w:left w:type="dxa" w:w="120"/>
+              <w:bottom w:type="dxa" w:w="60"/>
+              <w:right w:type="dxa" w:w="120"/>
+            </w:tcMar>
+            <w:vAlign w:val="center"/>
+          </w:tcPr>
+          <w:p>
+            <w:pPr>
+              <w:spacing w:after="0"/>
+            </w:pPr>
+            <w:r>
+              <w:rPr>
+                <w:rFonts w:ascii="Arial" w:cs="Arial" w:eastAsia="Arial" w:hAnsi="Arial"/>
+                <w:color w:val="1E293B"/>
+                <w:sz w:val="20"/>
+                <w:szCs w:val="20"/>
+              </w:rPr>
+              <w:t xml:space="preserve">禁用任务</w:t>
+            </w:r>
+          </w:p>
+        </w:tc>
+        <w:tc>
+          <w:tcPr>
+            <w:tcW w:type="dxa" w:w="4560"/>
+            <w:tcBorders>
+              <w:top w:val="single" w:color="CBD5E1" w:sz="1"/>
+              <w:left w:val="single" w:color="CBD5E1" w:sz="1"/>
+              <w:bottom w:val="single" w:color="CBD5E1" w:sz="1"/>
+              <w:right w:val="single" w:color="CBD5E1" w:sz="1"/>
+            </w:tcBorders>
+            <w:shd w:fill="F8FAFC" w:val="clear"/>
+            <w:tcMar>
+              <w:top w:type="dxa" w:w="60"/>
+              <w:left w:type="dxa" w:w="120"/>
+              <w:bottom w:type="dxa" w:w="60"/>
+              <w:right w:type="dxa" w:w="120"/>
+            </w:tcMar>
+            <w:vAlign w:val="center"/>
+          </w:tcPr>
+          <w:p>
+            <w:pPr>
+              <w:spacing w:after="0"/>
+            </w:pPr>
+            <w:r>
+              <w:rPr>
+                <w:rFonts w:ascii="Arial" w:cs="Arial" w:eastAsia="Arial" w:hAnsi="Arial"/>
+                <w:color w:val="1E293B"/>
+                <w:sz w:val="20"/>
+                <w:szCs w:val="20"/>
+              </w:rPr>
+              <w:t xml:space="preserve">openclaw cron disable &lt;jobId&gt;</w:t>
+            </w:r>
+          </w:p>
+        </w:tc>
+        <w:tc>
+          <w:tcPr>
+            <w:tcW w:type="dxa" w:w="2600"/>
+            <w:tcBorders>
+              <w:top w:val="single" w:color="CBD5E1" w:sz="1"/>
+              <w:left w:val="single" w:color="CBD5E1" w:sz="1"/>
+              <w:bottom w:val="single" w:color="CBD5E1" w:sz="1"/>
+              <w:right w:val="single" w:color="CBD5E1" w:sz="1"/>
+            </w:tcBorders>
+            <w:shd w:fill="F8FAFC" w:val="clear"/>
+            <w:tcMar>
+              <w:top w:type="dxa" w:w="60"/>
+              <w:left w:type="dxa" w:w="120"/>
+              <w:bottom w:type="dxa" w:w="60"/>
+              <w:right w:type="dxa" w:w="120"/>
+            </w:tcMar>
+            <w:vAlign w:val="center"/>
+          </w:tcPr>
+          <w:p>
+            <w:pPr>
+              <w:spacing w:after="0"/>
+            </w:pPr>
+            <w:r>
+              <w:rPr>
+                <w:rFonts w:ascii="Arial" w:cs="Arial" w:eastAsia="Arial" w:hAnsi="Arial"/>
+                <w:color w:val="1E293B"/>
+                <w:sz w:val="20"/>
+                <w:szCs w:val="20"/>
+              </w:rPr>
+              <w:t xml:space="preserve">暂停任务但保留配置</w:t>
+            </w:r>
+          </w:p>
+        </w:tc>
+      </w:tr>
+      <w:tr>
+        <w:tc>
+          <w:tcPr>
+            <w:tcW w:type="dxa" w:w="2200"/>
+            <w:tcBorders>
+              <w:top w:val="single" w:color="CBD5E1" w:sz="1"/>
+              <w:left w:val="single" w:color="CBD5E1" w:sz="1"/>
+              <w:bottom w:val="single" w:color="CBD5E1" w:sz="1"/>
+              <w:right w:val="single" w:color="CBD5E1" w:sz="1"/>
+            </w:tcBorders>
+            <w:tcMar>
+              <w:top w:type="dxa" w:w="60"/>
+              <w:left w:type="dxa" w:w="120"/>
+              <w:bottom w:type="dxa" w:w="60"/>
+              <w:right w:type="dxa" w:w="120"/>
+            </w:tcMar>
+            <w:vAlign w:val="center"/>
+          </w:tcPr>
+          <w:p>
+            <w:pPr>
+              <w:spacing w:after="0"/>
+            </w:pPr>
+            <w:r>
+              <w:rPr>
+                <w:rFonts w:ascii="Arial" w:cs="Arial" w:eastAsia="Arial" w:hAnsi="Arial"/>
+                <w:color w:val="1E293B"/>
+                <w:sz w:val="20"/>
+                <w:szCs w:val="20"/>
+              </w:rPr>
+              <w:t xml:space="preserve">立即运行</w:t>
+            </w:r>
+          </w:p>
+        </w:tc>
+        <w:tc>
+          <w:tcPr>
+            <w:tcW w:type="dxa" w:w="4560"/>
+            <w:tcBorders>
+              <w:top w:val="single" w:color="CBD5E1" w:sz="1"/>
+              <w:left w:val="single" w:color="CBD5E1" w:sz="1"/>
+              <w:bottom w:val="single" w:color="CBD5E1" w:sz="1"/>
+              <w:right w:val="single" w:color="CBD5E1" w:sz="1"/>
+            </w:tcBorders>
+            <w:tcMar>
+              <w:top w:type="dxa" w:w="60"/>
+              <w:left w:type="dxa" w:w="120"/>
+              <w:bottom w:type="dxa" w:w="60"/>
+              <w:right w:type="dxa" w:w="120"/>
+            </w:tcMar>
+            <w:vAlign w:val="center"/>
+          </w:tcPr>
+          <w:p>
+            <w:pPr>
+              <w:spacing w:after="0"/>
+            </w:pPr>
+            <w:r>
+              <w:rPr>
+                <w:rFonts w:ascii="Arial" w:cs="Arial" w:eastAsia="Arial" w:hAnsi="Arial"/>
+                <w:color w:val="1E293B"/>
+                <w:sz w:val="20"/>
+                <w:szCs w:val="20"/>
+              </w:rPr>
+              <w:t xml:space="preserve">openclaw cron run &lt;jobId&gt;</w:t>
+            </w:r>
+          </w:p>
+        </w:tc>
+        <w:tc>
+          <w:tcPr>
+            <w:tcW w:type="dxa" w:w="2600"/>
+            <w:tcBorders>
+              <w:top w:val="single" w:color="CBD5E1" w:sz="1"/>
+              <w:left w:val="single" w:color="CBD5E1" w:sz="1"/>
+              <w:bottom w:val="single" w:color="CBD5E1" w:sz="1"/>
+              <w:right w:val="single" w:color="CBD5E1" w:sz="1"/>
+            </w:tcBorders>
+            <w:tcMar>
+              <w:top w:type="dxa" w:w="60"/>
+              <w:left w:type="dxa" w:w="120"/>
+              <w:bottom w:type="dxa" w:w="60"/>
+              <w:right w:type="dxa" w:w="120"/>
+            </w:tcMar>
+            <w:vAlign w:val="center"/>
+          </w:tcPr>
+          <w:p>
+            <w:pPr>
+              <w:spacing w:after="0"/>
+            </w:pPr>
+            <w:r>
+              <w:rPr>
+                <w:rFonts w:ascii="Arial" w:cs="Arial" w:eastAsia="Arial" w:hAnsi="Arial"/>
+                <w:color w:val="1E293B"/>
+                <w:sz w:val="20"/>
+                <w:szCs w:val="20"/>
+              </w:rPr>
+              <w:t xml:space="preserve">手动触发一次执行</w:t>
+            </w:r>
+          </w:p>
+        </w:tc>
+      </w:tr>
+    </w:tbl>
+    <w:p>
+      <w:pPr>
+        <w:pStyle w:val="Heading3"/>
+      </w:pPr>
+      <w:r>
+        <w:t xml:space="preserve">3.12.4 UI 设计</w:t>
+      </w:r>
+    </w:p>
+    <w:p>
+      <w:pPr>
+        <w:pStyle w:val="ListParagraph"/>
+        <w:numPr>
+          <w:ilvl w:val="0"/>
+          <w:numId w:val="12"/>
+        </w:numPr>
+        <w:spacing w:after="70" w:line="300"/>
+      </w:pPr>
+      <w:r>
+        <w:rPr>
+          <w:rFonts w:ascii="Arial" w:cs="Arial" w:eastAsia="Arial" w:hAnsi="Arial"/>
+          <w:color w:val="1E293B"/>
+          <w:sz w:val="22"/>
+          <w:szCs w:val="22"/>
+        </w:rPr>
+        <w:t xml:space="preserve">使用 List + ForEach 展示，每个任务一行</w:t>
+      </w:r>
+    </w:p>
+    <w:p>
+      <w:pPr>
+        <w:pStyle w:val="ListParagraph"/>
+        <w:numPr>
+          <w:ilvl w:val="0"/>
+          <w:numId w:val="12"/>
+        </w:numPr>
+        <w:spacing w:after="70" w:line="300"/>
+      </w:pPr>
+      <w:r>
+        <w:rPr>
+          <w:rFonts w:ascii="Arial" w:cs="Arial" w:eastAsia="Arial" w:hAnsi="Arial"/>
+          <w:color w:val="1E293B"/>
+          <w:sz w:val="22"/>
+          <w:szCs w:val="22"/>
+        </w:rPr>
+        <w:t xml:space="preserve">已禁用的任务 .opacity(0.5) 降低透明度</w:t>
+      </w:r>
+    </w:p>
+    <w:p>
+      <w:pPr>
+        <w:pStyle w:val="ListParagraph"/>
+        <w:numPr>
+          <w:ilvl w:val="0"/>
+          <w:numId w:val="12"/>
+        </w:numPr>
+        <w:spacing w:after="70" w:line="300"/>
+      </w:pPr>
+      <w:r>
+        <w:rPr>
+          <w:rFonts w:ascii="Arial" w:cs="Arial" w:eastAsia="Arial" w:hAnsi="Arial"/>
+          <w:color w:val="1E293B"/>
+          <w:sz w:val="22"/>
+          <w:szCs w:val="22"/>
+        </w:rPr>
+        <w:t xml:space="preserve">列表右侧显示快捷操作按钮 (swipeActions 或右键菜单)</w:t>
+      </w:r>
+    </w:p>
+    <w:p>
+      <w:pPr>
+        <w:pStyle w:val="ListParagraph"/>
+        <w:numPr>
+          <w:ilvl w:val="0"/>
+          <w:numId w:val="12"/>
+        </w:numPr>
+        <w:spacing w:after="70" w:line="300"/>
+      </w:pPr>
+      <w:r>
+        <w:rPr>
+          <w:rFonts w:ascii="Arial" w:cs="Arial" w:eastAsia="Arial" w:hAnsi="Arial"/>
+          <w:color w:val="1E293B"/>
+          <w:sz w:val="22"/>
+          <w:szCs w:val="22"/>
+        </w:rPr>
+        <w:t xml:space="preserve">Cron 表达式翻译: 将 “0 9 * * 1-5” 翻译为 “工作日 每天 9:00”，可用简单规则匹配常见模式</w:t>
+      </w:r>
+    </w:p>
+    <w:p>
+      <w:pPr>
+        <w:pStyle w:val="ListParagraph"/>
+        <w:numPr>
+          <w:ilvl w:val="0"/>
+          <w:numId w:val="12"/>
+        </w:numPr>
+        <w:spacing w:after="70" w:line="300"/>
+      </w:pPr>
+      <w:r>
+        <w:rPr>
+          <w:rFonts w:ascii="Arial" w:cs="Arial" w:eastAsia="Arial" w:hAnsi="Arial"/>
+          <w:color w:val="1E293B"/>
+          <w:sz w:val="22"/>
+          <w:szCs w:val="22"/>
+        </w:rPr>
+        <w:t xml:space="preserve">任务为空时显示“暂无 Cron 任务”空状态提示</w:t>
+      </w:r>
+    </w:p>
+    <w:p>
+      <w:pPr>
+        <w:pStyle w:val="ListParagraph"/>
+        <w:numPr>
+          <w:ilvl w:val="0"/>
+          <w:numId w:val="12"/>
+        </w:numPr>
+        <w:spacing w:after="70" w:line="300"/>
+      </w:pPr>
+      <w:r>
+        <w:rPr>
+          <w:rFonts w:ascii="Arial" w:cs="Arial" w:eastAsia="Arial" w:hAnsi="Arial"/>
+          <w:color w:val="1E293B"/>
+          <w:sz w:val="22"/>
+          <w:szCs w:val="22"/>
+        </w:rPr>
+        <w:t xml:space="preserve">Mock 模式下显示 3-4 个示例任务 (每日简报、周报、服务器检查、一次性提醒)</w:t>
+      </w:r>
+    </w:p>
+    <w:p>
       <w:r>
         <w:br w:type="page"/>
       </w:r>
@@ -20266,6 +22358,231 @@
       </w:r>
     </w:p>
     <w:p>
+      <w:pPr>
+        <w:pStyle w:val="Heading2"/>
+      </w:pPr>
+      <w:r>
+        <w:t xml:space="preserve">4.6 配置解析错误诊断</w:t>
+      </w:r>
+    </w:p>
+    <w:p>
+      <w:pPr>
+        <w:spacing w:after="70" w:line="300"/>
+      </w:pPr>
+      <w:r>
+        <w:rPr>
+          <w:rFonts w:ascii="Arial" w:cs="Arial" w:eastAsia="Arial" w:hAnsi="Arial"/>
+          <w:color w:val="1E293B"/>
+          <w:sz w:val="22"/>
+          <w:szCs w:val="22"/>
+        </w:rPr>
+        <w:t xml:space="preserve">当 ConfigService 读取到配置文件但解析失败时，App 会静默回退到 Demo Mode。为方便用户诊断，引入了解析错误可见性机制。</w:t>
+      </w:r>
+    </w:p>
+    <w:p>
+      <w:pPr>
+        <w:pStyle w:val="Heading3"/>
+      </w:pPr>
+      <w:r>
+        <w:t xml:space="preserve">4.6.1 错误暴露机制</w:t>
+      </w:r>
+    </w:p>
+    <w:p>
+      <w:pPr>
+        <w:pStyle w:val="ListParagraph"/>
+        <w:numPr>
+          <w:ilvl w:val="0"/>
+          <w:numId w:val="2"/>
+        </w:numPr>
+        <w:spacing w:after="70" w:line="300"/>
+      </w:pPr>
+      <w:r>
+        <w:rPr>
+          <w:rFonts w:ascii="Arial" w:cs="Arial" w:eastAsia="Arial" w:hAnsi="Arial"/>
+          <w:color w:val="1E293B"/>
+          <w:sz w:val="22"/>
+          <w:szCs w:val="22"/>
+        </w:rPr>
+        <w:t xml:space="preserve">ConfigService 新增 lastError: String? 属性，区分四类 DecodingError 并输出中文描述（缺少字段、类型不匹配、值为空、其他）</w:t>
+      </w:r>
+    </w:p>
+    <w:p>
+      <w:pPr>
+        <w:pStyle w:val="ListParagraph"/>
+        <w:numPr>
+          <w:ilvl w:val="0"/>
+          <w:numId w:val="2"/>
+        </w:numPr>
+        <w:spacing w:after="70" w:line="300"/>
+      </w:pPr>
+      <w:r>
+        <w:rPr>
+          <w:rFonts w:ascii="Arial" w:cs="Arial" w:eastAsia="Arial" w:hAnsi="Arial"/>
+          <w:color w:val="1E293B"/>
+          <w:sz w:val="22"/>
+          <w:szCs w:val="22"/>
+        </w:rPr>
+        <w:t xml:space="preserve">AppViewModel 将 configError: String? 传递给 Demo Mode 横条</w:t>
+      </w:r>
+    </w:p>
+    <w:p>
+      <w:pPr>
+        <w:pStyle w:val="ListParagraph"/>
+        <w:numPr>
+          <w:ilvl w:val="0"/>
+          <w:numId w:val="2"/>
+        </w:numPr>
+        <w:spacing w:after="70" w:line="300"/>
+      </w:pPr>
+      <w:r>
+        <w:rPr>
+          <w:rFonts w:ascii="Arial" w:cs="Arial" w:eastAsia="Arial" w:hAnsi="Arial"/>
+          <w:color w:val="1E293B"/>
+          <w:sz w:val="22"/>
+          <w:szCs w:val="22"/>
+        </w:rPr>
+        <w:t xml:space="preserve">Demo Mode 横条：有解析错误时显示 ⚠️ 图标 + “解析失败：{具体字段路径}”，无配置文件时显示原有提示</w:t>
+      </w:r>
+    </w:p>
+    <w:p>
+      <w:pPr>
+        <w:pStyle w:val="Heading3"/>
+      </w:pPr>
+      <w:r>
+        <w:t xml:space="preserve">4.6.2 真实 openclaw.json 格式说明</w:t>
+      </w:r>
+    </w:p>
+    <w:p>
+      <w:pPr>
+        <w:spacing w:after="70" w:line="300"/>
+      </w:pPr>
+      <w:r>
+        <w:rPr>
+          <w:rFonts w:ascii="Arial" w:cs="Arial" w:eastAsia="Arial" w:hAnsi="Arial"/>
+          <w:color w:val="1E293B"/>
+          <w:sz w:val="22"/>
+          <w:szCs w:val="22"/>
+        </w:rPr>
+        <w:t xml:space="preserve">实际配置文件与 PRD 初始示例存在以下结构差异，数据模型已按真实格式修正：</w:t>
+      </w:r>
+    </w:p>
+    <w:p>
+      <w:pPr>
+        <w:pStyle w:val="ListParagraph"/>
+        <w:numPr>
+          <w:ilvl w:val="0"/>
+          <w:numId w:val="2"/>
+        </w:numPr>
+        <w:spacing w:after="70" w:line="300"/>
+      </w:pPr>
+      <w:r>
+        <w:rPr>
+          <w:rFonts w:ascii="Arial" w:cs="Arial" w:eastAsia="Arial" w:hAnsi="Arial"/>
+          <w:color w:val="1E293B"/>
+          <w:sz w:val="22"/>
+          <w:szCs w:val="22"/>
+          <w:b/>
+        </w:rPr>
+        <w:t xml:space="preserve">agents</w:t>
+      </w:r>
+      <w:r>
+        <w:rPr>
+          <w:rFonts w:ascii="Arial" w:cs="Arial" w:eastAsia="Arial" w:hAnsi="Arial"/>
+          <w:color w:val="1E293B"/>
+          <w:sz w:val="22"/>
+          <w:szCs w:val="22"/>
+        </w:rPr>
+        <w:t xml:space="preserve">：不是数组，是 { defaults: {...}, list: [{id, default}] } 字典结构。list 中每个 agent 只有 id 和 default 布尔值，无 name/emoji/platforms。默认模型取自 agents.defaults.model.primary</w:t>
+      </w:r>
+    </w:p>
+    <w:p>
+      <w:pPr>
+        <w:pStyle w:val="ListParagraph"/>
+        <w:numPr>
+          <w:ilvl w:val="0"/>
+          <w:numId w:val="2"/>
+        </w:numPr>
+        <w:spacing w:after="70" w:line="300"/>
+      </w:pPr>
+      <w:r>
+        <w:rPr>
+          <w:rFonts w:ascii="Arial" w:cs="Arial" w:eastAsia="Arial" w:hAnsi="Arial"/>
+          <w:color w:val="1E293B"/>
+          <w:sz w:val="22"/>
+          <w:szCs w:val="22"/>
+          <w:b/>
+        </w:rPr>
+        <w:t xml:space="preserve">agent.model</w:t>
+      </w:r>
+      <w:r>
+        <w:rPr>
+          <w:rFonts w:ascii="Arial" w:cs="Arial" w:eastAsia="Arial" w:hAnsi="Arial"/>
+          <w:color w:val="1E293B"/>
+          <w:sz w:val="22"/>
+          <w:szCs w:val="22"/>
+        </w:rPr>
+        <w:t xml:space="preserve">：可为 String 或 { primary: String, fallbacks: [...] } 对象，解析时两种格式均兼容</w:t>
+      </w:r>
+    </w:p>
+    <w:p>
+      <w:pPr>
+        <w:pStyle w:val="ListParagraph"/>
+        <w:numPr>
+          <w:ilvl w:val="0"/>
+          <w:numId w:val="2"/>
+        </w:numPr>
+        <w:spacing w:after="70" w:line="300"/>
+      </w:pPr>
+      <w:r>
+        <w:rPr>
+          <w:rFonts w:ascii="Arial" w:cs="Arial" w:eastAsia="Arial" w:hAnsi="Arial"/>
+          <w:color w:val="1E293B"/>
+          <w:sz w:val="22"/>
+          <w:szCs w:val="22"/>
+          <w:b/>
+        </w:rPr>
+        <w:t xml:space="preserve">models.providers</w:t>
+      </w:r>
+      <w:r>
+        <w:rPr>
+          <w:rFonts w:ascii="Arial" w:cs="Arial" w:eastAsia="Arial" w:hAnsi="Arial"/>
+          <w:color w:val="1E293B"/>
+          <w:sz w:val="22"/>
+          <w:szCs w:val="22"/>
+        </w:rPr>
+        <w:t xml:space="preserve">：不是数组，是以 provider slug 为 key 的字典（如 “kimi-coding”: { baseUrl, api, models: [...] }）</w:t>
+      </w:r>
+    </w:p>
+    <w:p>
+      <w:pPr>
+        <w:pStyle w:val="ListParagraph"/>
+        <w:numPr>
+          <w:ilvl w:val="0"/>
+          <w:numId w:val="2"/>
+        </w:numPr>
+        <w:spacing w:after="70" w:line="300"/>
+      </w:pPr>
+      <w:r>
+        <w:rPr>
+          <w:rFonts w:ascii="Arial" w:cs="Arial" w:eastAsia="Arial" w:hAnsi="Arial"/>
+          <w:color w:val="1E293B"/>
+          <w:sz w:val="22"/>
+          <w:szCs w:val="22"/>
+          <w:b/>
+        </w:rPr>
+        <w:t xml:space="preserve">gateway</w:t>
+      </w:r>
+      <w:r>
+        <w:rPr>
+          <w:rFonts w:ascii="Arial" w:cs="Arial" w:eastAsia="Arial" w:hAnsi="Arial"/>
+          <w:color w:val="1E293B"/>
+          <w:sz w:val="22"/>
+          <w:szCs w:val="22"/>
+        </w:rPr>
+        <w:t xml:space="preserve">：无 port 字段，GatewayConfig 自定义 init 默认值为 18789</w:t>
+      </w:r>
+    </w:p>
+    <w:p>
       <w:r>
         <w:br w:type="page"/>
       </w:r>
@@ -21470,7 +23787,7 @@
                 <w:sz w:val="20"/>
                 <w:szCs w:val="20"/>
               </w:rPr>
-              <w:t xml:space="preserve">  Views/Pages/PixelOfficeView.swift</w:t>
+              <w:t xml:space="preserve">  Views/Pages/CronJobsView.swift</w:t>
             </w:r>
           </w:p>
         </w:tc>
@@ -21502,7 +23819,7 @@
                 <w:sz w:val="20"/>
                 <w:szCs w:val="20"/>
               </w:rPr>
-              <w:t xml:space="preserve">像素办公室页</w:t>
+              <w:t xml:space="preserve">Cron 定时任务页</w:t>
             </w:r>
           </w:p>
         </w:tc>
@@ -21537,7 +23854,7 @@
                 <w:sz w:val="20"/>
                 <w:szCs w:val="20"/>
               </w:rPr>
-              <w:t xml:space="preserve">  Views/Components/</w:t>
+              <w:t xml:space="preserve">  Views/Pages/PixelOfficeView.swift</w:t>
             </w:r>
           </w:p>
         </w:tc>
@@ -21570,7 +23887,7 @@
                 <w:sz w:val="20"/>
                 <w:szCs w:val="20"/>
               </w:rPr>
-              <w:t xml:space="preserve">可复用组件</w:t>
+              <w:t xml:space="preserve">像素办公室页</w:t>
             </w:r>
           </w:p>
         </w:tc>
@@ -21604,7 +23921,7 @@
                 <w:sz w:val="20"/>
                 <w:szCs w:val="20"/>
               </w:rPr>
-              <w:t xml:space="preserve">  Views/Components/StatusDot.swift</w:t>
+              <w:t xml:space="preserve">  Views/Components/</w:t>
             </w:r>
           </w:p>
         </w:tc>
@@ -21636,7 +23953,7 @@
                 <w:sz w:val="20"/>
                 <w:szCs w:val="20"/>
               </w:rPr>
-              <w:t xml:space="preserve">状态指示器圆点</w:t>
+              <w:t xml:space="preserve">可复用组件</w:t>
             </w:r>
           </w:p>
         </w:tc>
@@ -21671,7 +23988,7 @@
                 <w:sz w:val="20"/>
                 <w:szCs w:val="20"/>
               </w:rPr>
-              <w:t xml:space="preserve">  Views/Components/PlatformBadge.swift</w:t>
+              <w:t xml:space="preserve">  Views/Components/StatusDot.swift</w:t>
             </w:r>
           </w:p>
         </w:tc>
@@ -21704,7 +24021,7 @@
                 <w:sz w:val="20"/>
                 <w:szCs w:val="20"/>
               </w:rPr>
-              <w:t xml:space="preserve">平台徽章 Capsule</w:t>
+              <w:t xml:space="preserve">状态指示器圆点</w:t>
             </w:r>
           </w:p>
         </w:tc>
@@ -21738,7 +24055,7 @@
                 <w:sz w:val="20"/>
                 <w:szCs w:val="20"/>
               </w:rPr>
-              <w:t xml:space="preserve">  Views/Components/AgentCard.swift</w:t>
+              <w:t xml:space="preserve">  Views/Components/PlatformBadge.swift</w:t>
             </w:r>
           </w:p>
         </w:tc>
@@ -21770,7 +24087,7 @@
                 <w:sz w:val="20"/>
                 <w:szCs w:val="20"/>
               </w:rPr>
-              <w:t xml:space="preserve">Agent 卡片组件</w:t>
+              <w:t xml:space="preserve">平台徽章 Capsule</w:t>
             </w:r>
           </w:p>
         </w:tc>
@@ -21805,7 +24122,7 @@
                 <w:sz w:val="20"/>
                 <w:szCs w:val="20"/>
               </w:rPr>
-              <w:t xml:space="preserve">  Views/Components/StatCard.swift</w:t>
+              <w:t xml:space="preserve">  Views/Components/AgentCard.swift</w:t>
             </w:r>
           </w:p>
         </w:tc>
@@ -21838,7 +24155,7 @@
                 <w:sz w:val="20"/>
                 <w:szCs w:val="20"/>
               </w:rPr>
-              <w:t xml:space="preserve">概览统计卡片</w:t>
+              <w:t xml:space="preserve">Agent 卡片组件</w:t>
             </w:r>
           </w:p>
         </w:tc>
@@ -21872,7 +24189,7 @@
                 <w:sz w:val="20"/>
                 <w:szCs w:val="20"/>
               </w:rPr>
-              <w:t xml:space="preserve">  Views/Settings/SettingsView.swift</w:t>
+              <w:t xml:space="preserve">  Views/Components/StatCard.swift</w:t>
             </w:r>
           </w:p>
         </w:tc>
@@ -21904,7 +24221,7 @@
                 <w:sz w:val="20"/>
                 <w:szCs w:val="20"/>
               </w:rPr>
-              <w:t xml:space="preserve">设置窗口 (Settings scene)</w:t>
+              <w:t xml:space="preserve">概览统计卡片</w:t>
             </w:r>
           </w:p>
         </w:tc>
@@ -21939,7 +24256,7 @@
                 <w:sz w:val="20"/>
                 <w:szCs w:val="20"/>
               </w:rPr>
-              <w:t xml:space="preserve">  ViewModels/</w:t>
+              <w:t xml:space="preserve">  Views/Settings/SettingsView.swift</w:t>
             </w:r>
           </w:p>
         </w:tc>
@@ -21972,7 +24289,7 @@
                 <w:sz w:val="20"/>
                 <w:szCs w:val="20"/>
               </w:rPr>
-              <w:t xml:space="preserve">MVVM ViewModel 层</w:t>
+              <w:t xml:space="preserve">设置窗口 (Settings scene)</w:t>
             </w:r>
           </w:p>
         </w:tc>
@@ -22006,7 +24323,7 @@
                 <w:sz w:val="20"/>
                 <w:szCs w:val="20"/>
               </w:rPr>
-              <w:t xml:space="preserve">  ViewModels/AppViewModel.swift</w:t>
+              <w:t xml:space="preserve">  ViewModels/</w:t>
             </w:r>
           </w:p>
         </w:tc>
@@ -22038,7 +24355,7 @@
                 <w:sz w:val="20"/>
                 <w:szCs w:val="20"/>
               </w:rPr>
-              <w:t xml:space="preserve">全局状态管理 (@Observable)</w:t>
+              <w:t xml:space="preserve">MVVM ViewModel 层</w:t>
             </w:r>
           </w:p>
         </w:tc>
@@ -22073,7 +24390,7 @@
                 <w:sz w:val="20"/>
                 <w:szCs w:val="20"/>
               </w:rPr>
-              <w:t xml:space="preserve">  ViewModels/AgentsViewModel.swift</w:t>
+              <w:t xml:space="preserve">  ViewModels/AppViewModel.swift</w:t>
             </w:r>
           </w:p>
         </w:tc>
@@ -22106,7 +24423,7 @@
                 <w:sz w:val="20"/>
                 <w:szCs w:val="20"/>
               </w:rPr>
-              <w:t xml:space="preserve">Agent 数据管理</w:t>
+              <w:t xml:space="preserve">全局状态管理 (@Observable)</w:t>
             </w:r>
           </w:p>
         </w:tc>
@@ -22140,7 +24457,7 @@
                 <w:sz w:val="20"/>
                 <w:szCs w:val="20"/>
               </w:rPr>
-              <w:t xml:space="preserve">  ViewModels/GatewayMonitor.swift</w:t>
+              <w:t xml:space="preserve">  ViewModels/AgentsViewModel.swift</w:t>
             </w:r>
           </w:p>
         </w:tc>
@@ -22172,7 +24489,7 @@
                 <w:sz w:val="20"/>
                 <w:szCs w:val="20"/>
               </w:rPr>
-              <w:t xml:space="preserve">Gateway 健康定时检测</w:t>
+              <w:t xml:space="preserve">Agent 数据管理</w:t>
             </w:r>
           </w:p>
         </w:tc>
@@ -22207,7 +24524,7 @@
                 <w:sz w:val="20"/>
                 <w:szCs w:val="20"/>
               </w:rPr>
-              <w:t xml:space="preserve">  ViewModels/FileWatcher.swift</w:t>
+              <w:t xml:space="preserve">  ViewModels/GatewayMonitor.swift</w:t>
             </w:r>
           </w:p>
         </w:tc>
@@ -22240,7 +24557,7 @@
                 <w:sz w:val="20"/>
                 <w:szCs w:val="20"/>
               </w:rPr>
-              <w:t xml:space="preserve">配置文件监听器</w:t>
+              <w:t xml:space="preserve">Gateway 健康定时检测</w:t>
             </w:r>
           </w:p>
         </w:tc>
@@ -22274,7 +24591,7 @@
                 <w:sz w:val="20"/>
                 <w:szCs w:val="20"/>
               </w:rPr>
-              <w:t xml:space="preserve">  Models/</w:t>
+              <w:t xml:space="preserve">  ViewModels/FileWatcher.swift</w:t>
             </w:r>
           </w:p>
         </w:tc>
@@ -22306,7 +24623,7 @@
                 <w:sz w:val="20"/>
                 <w:szCs w:val="20"/>
               </w:rPr>
-              <w:t xml:space="preserve">数据模型 (Codable structs)</w:t>
+              <w:t xml:space="preserve">配置文件监听器</w:t>
             </w:r>
           </w:p>
         </w:tc>
@@ -22341,7 +24658,7 @@
                 <w:sz w:val="20"/>
                 <w:szCs w:val="20"/>
               </w:rPr>
-              <w:t xml:space="preserve">  Models/OpenClawConfig.swift</w:t>
+              <w:t xml:space="preserve">  Models/</w:t>
             </w:r>
           </w:p>
         </w:tc>
@@ -22374,7 +24691,7 @@
                 <w:sz w:val="20"/>
                 <w:szCs w:val="20"/>
               </w:rPr>
-              <w:t xml:space="preserve">配置文件数据模型</w:t>
+              <w:t xml:space="preserve">数据模型 (Codable structs)</w:t>
             </w:r>
           </w:p>
         </w:tc>
@@ -22408,7 +24725,7 @@
                 <w:sz w:val="20"/>
                 <w:szCs w:val="20"/>
               </w:rPr>
-              <w:t xml:space="preserve">  Models/SessionInfo.swift</w:t>
+              <w:t xml:space="preserve">  Models/OpenClawConfig.swift</w:t>
             </w:r>
           </w:p>
         </w:tc>
@@ -22440,7 +24757,7 @@
                 <w:sz w:val="20"/>
                 <w:szCs w:val="20"/>
               </w:rPr>
-              <w:t xml:space="preserve">会话数据模型</w:t>
+              <w:t xml:space="preserve">配置文件数据模型</w:t>
             </w:r>
           </w:p>
         </w:tc>
@@ -22475,7 +24792,7 @@
                 <w:sz w:val="20"/>
                 <w:szCs w:val="20"/>
               </w:rPr>
-              <w:t xml:space="preserve">  Models/AlertItem.swift</w:t>
+              <w:t xml:space="preserve">  Models/SessionInfo.swift</w:t>
             </w:r>
           </w:p>
         </w:tc>
@@ -22508,7 +24825,7 @@
                 <w:sz w:val="20"/>
                 <w:szCs w:val="20"/>
               </w:rPr>
-              <w:t xml:space="preserve">告警数据模型</w:t>
+              <w:t xml:space="preserve">会话数据模型</w:t>
             </w:r>
           </w:p>
         </w:tc>
@@ -22542,7 +24859,7 @@
                 <w:sz w:val="20"/>
                 <w:szCs w:val="20"/>
               </w:rPr>
-              <w:t xml:space="preserve">  Services/</w:t>
+              <w:t xml:space="preserve">  Models/AlertItem.swift</w:t>
             </w:r>
           </w:p>
         </w:tc>
@@ -22574,7 +24891,7 @@
                 <w:sz w:val="20"/>
                 <w:szCs w:val="20"/>
               </w:rPr>
-              <w:t xml:space="preserve">服务层</w:t>
+              <w:t xml:space="preserve">告警数据模型</w:t>
             </w:r>
           </w:p>
         </w:tc>
@@ -22609,7 +24926,7 @@
                 <w:sz w:val="20"/>
                 <w:szCs w:val="20"/>
               </w:rPr>
-              <w:t xml:space="preserve">  Services/ConfigService.swift</w:t>
+              <w:t xml:space="preserve">  Models/CronJob.swift</w:t>
             </w:r>
           </w:p>
         </w:tc>
@@ -22642,7 +24959,7 @@
                 <w:sz w:val="20"/>
                 <w:szCs w:val="20"/>
               </w:rPr>
-              <w:t xml:space="preserve">配置文件读取、解析、缓存</w:t>
+              <w:t xml:space="preserve">Cron 任务数据模型</w:t>
             </w:r>
           </w:p>
         </w:tc>
@@ -22676,7 +24993,7 @@
                 <w:sz w:val="20"/>
                 <w:szCs w:val="20"/>
               </w:rPr>
-              <w:t xml:space="preserve">  Services/GatewayService.swift</w:t>
+              <w:t xml:space="preserve">  Services/</w:t>
             </w:r>
           </w:p>
         </w:tc>
@@ -22708,7 +25025,7 @@
                 <w:sz w:val="20"/>
                 <w:szCs w:val="20"/>
               </w:rPr>
-              <w:t xml:space="preserve">Gateway HTTP API 调用</w:t>
+              <w:t xml:space="preserve">服务层</w:t>
             </w:r>
           </w:p>
         </w:tc>
@@ -22743,7 +25060,7 @@
                 <w:sz w:val="20"/>
                 <w:szCs w:val="20"/>
               </w:rPr>
-              <w:t xml:space="preserve">  Services/SessionService.swift</w:t>
+              <w:t xml:space="preserve">  Services/ConfigService.swift</w:t>
             </w:r>
           </w:p>
         </w:tc>
@@ -22776,7 +25093,7 @@
                 <w:sz w:val="20"/>
                 <w:szCs w:val="20"/>
               </w:rPr>
-              <w:t xml:space="preserve">会话文件读取</w:t>
+              <w:t xml:space="preserve">配置文件读取、解析、缓存</w:t>
             </w:r>
           </w:p>
         </w:tc>
@@ -22810,7 +25127,7 @@
                 <w:sz w:val="20"/>
                 <w:szCs w:val="20"/>
               </w:rPr>
-              <w:t xml:space="preserve">  Services/SkillService.swift</w:t>
+              <w:t xml:space="preserve">  Services/GatewayService.swift</w:t>
             </w:r>
           </w:p>
         </w:tc>
@@ -22842,7 +25159,7 @@
                 <w:sz w:val="20"/>
                 <w:szCs w:val="20"/>
               </w:rPr>
-              <w:t xml:space="preserve">技能目录扫描</w:t>
+              <w:t xml:space="preserve">Gateway HTTP API 调用</w:t>
             </w:r>
           </w:p>
         </w:tc>
@@ -22877,7 +25194,7 @@
                 <w:sz w:val="20"/>
                 <w:szCs w:val="20"/>
               </w:rPr>
-              <w:t xml:space="preserve">  Services/NotificationService.swift</w:t>
+              <w:t xml:space="preserve">  Services/SessionService.swift</w:t>
             </w:r>
           </w:p>
         </w:tc>
@@ -22910,7 +25227,7 @@
                 <w:sz w:val="20"/>
                 <w:szCs w:val="20"/>
               </w:rPr>
-              <w:t xml:space="preserve">macOS 系统通知</w:t>
+              <w:t xml:space="preserve">会话文件读取</w:t>
             </w:r>
           </w:p>
         </w:tc>
@@ -22944,7 +25261,7 @@
                 <w:sz w:val="20"/>
                 <w:szCs w:val="20"/>
               </w:rPr>
-              <w:t xml:space="preserve">  Services/GatewayControlService.swift</w:t>
+              <w:t xml:space="preserve">  Services/SkillService.swift</w:t>
             </w:r>
           </w:p>
         </w:tc>
@@ -22976,7 +25293,7 @@
                 <w:sz w:val="20"/>
                 <w:szCs w:val="20"/>
               </w:rPr>
-              <w:t xml:space="preserve">Gateway CLI 命令执行 (Process)</w:t>
+              <w:t xml:space="preserve">技能目录扫描</w:t>
             </w:r>
           </w:p>
         </w:tc>
@@ -23011,7 +25328,7 @@
                 <w:sz w:val="20"/>
                 <w:szCs w:val="20"/>
               </w:rPr>
-              <w:t xml:space="preserve">  Services/StatsCollector.swift</w:t>
+              <w:t xml:space="preserve">  Services/CronService.swift</w:t>
             </w:r>
           </w:p>
         </w:tc>
@@ -23044,7 +25361,7 @@
                 <w:sz w:val="20"/>
                 <w:szCs w:val="20"/>
               </w:rPr>
-              <w:t xml:space="preserve">日志扫描 + 统计数据聚合 + 缓存</w:t>
+              <w:t xml:space="preserve">读取 jobs.json + runs JSONL + Cron 表达式翻译</w:t>
             </w:r>
           </w:p>
         </w:tc>
@@ -23078,7 +25395,7 @@
                 <w:sz w:val="20"/>
                 <w:szCs w:val="20"/>
               </w:rPr>
-              <w:t xml:space="preserve">  Services/CLILocator.swift</w:t>
+              <w:t xml:space="preserve">  Services/NotificationService.swift</w:t>
             </w:r>
           </w:p>
         </w:tc>
@@ -23110,7 +25427,7 @@
                 <w:sz w:val="20"/>
                 <w:szCs w:val="20"/>
               </w:rPr>
-              <w:t xml:space="preserve">查找 openclaw 可执行文件路径</w:t>
+              <w:t xml:space="preserve">macOS 系统通知</w:t>
             </w:r>
           </w:p>
         </w:tc>
@@ -23145,7 +25462,7 @@
                 <w:sz w:val="20"/>
                 <w:szCs w:val="20"/>
               </w:rPr>
-              <w:t xml:space="preserve">  PixelOffice/</w:t>
+              <w:t xml:space="preserve">  Services/GatewayControlService.swift</w:t>
             </w:r>
           </w:p>
         </w:tc>
@@ -23178,7 +25495,7 @@
                 <w:sz w:val="20"/>
                 <w:szCs w:val="20"/>
               </w:rPr>
-              <w:t xml:space="preserve">像素办公室渲染</w:t>
+              <w:t xml:space="preserve">Gateway CLI 命令执行 (Process)</w:t>
             </w:r>
           </w:p>
         </w:tc>
@@ -23212,7 +25529,7 @@
                 <w:sz w:val="20"/>
                 <w:szCs w:val="20"/>
               </w:rPr>
-              <w:t xml:space="preserve">  PixelOffice/OfficeScene.swift</w:t>
+              <w:t xml:space="preserve">  Services/StatsCollector.swift</w:t>
             </w:r>
           </w:p>
         </w:tc>
@@ -23244,7 +25561,7 @@
                 <w:sz w:val="20"/>
                 <w:szCs w:val="20"/>
               </w:rPr>
-              <w:t xml:space="preserve">SpriteKit SKScene 场景</w:t>
+              <w:t xml:space="preserve">日志扫描 + 统计数据聚合 + 缓存</w:t>
             </w:r>
           </w:p>
         </w:tc>
@@ -23279,7 +25596,7 @@
                 <w:sz w:val="20"/>
                 <w:szCs w:val="20"/>
               </w:rPr>
-              <w:t xml:space="preserve">  PixelOffice/AgentSprite.swift</w:t>
+              <w:t xml:space="preserve">  Services/CLILocator.swift</w:t>
             </w:r>
           </w:p>
         </w:tc>
@@ -23312,7 +25629,7 @@
                 <w:sz w:val="20"/>
                 <w:szCs w:val="20"/>
               </w:rPr>
-              <w:t xml:space="preserve">Agent 像素角色 SKNode</w:t>
+              <w:t xml:space="preserve">查找 openclaw 可执行文件路径</w:t>
             </w:r>
           </w:p>
         </w:tc>
@@ -23346,7 +25663,7 @@
                 <w:sz w:val="20"/>
                 <w:szCs w:val="20"/>
               </w:rPr>
-              <w:t xml:space="preserve">  PixelOffice/FurnitureNode.swift</w:t>
+              <w:t xml:space="preserve">  PixelOffice/</w:t>
             </w:r>
           </w:p>
         </w:tc>
@@ -23378,7 +25695,7 @@
                 <w:sz w:val="20"/>
                 <w:szCs w:val="20"/>
               </w:rPr>
-              <w:t xml:space="preserve">家具节点</w:t>
+              <w:t xml:space="preserve">像素办公室渲染</w:t>
             </w:r>
           </w:p>
         </w:tc>
@@ -23413,7 +25730,7 @@
                 <w:sz w:val="20"/>
                 <w:szCs w:val="20"/>
               </w:rPr>
-              <w:t xml:space="preserve">  Resources/</w:t>
+              <w:t xml:space="preserve">  PixelOffice/OfficeScene.swift</w:t>
             </w:r>
           </w:p>
         </w:tc>
@@ -23446,7 +25763,7 @@
                 <w:sz w:val="20"/>
                 <w:szCs w:val="20"/>
               </w:rPr>
-              <w:t xml:space="preserve">资源文件</w:t>
+              <w:t xml:space="preserve">SpriteKit SKScene 场景</w:t>
             </w:r>
           </w:p>
         </w:tc>
@@ -23480,7 +25797,7 @@
                 <w:sz w:val="20"/>
                 <w:szCs w:val="20"/>
               </w:rPr>
-              <w:t xml:space="preserve">  Resources/Localizable.xcstrings</w:t>
+              <w:t xml:space="preserve">  PixelOffice/AgentSprite.swift</w:t>
             </w:r>
           </w:p>
         </w:tc>
@@ -23512,7 +25829,7 @@
                 <w:sz w:val="20"/>
                 <w:szCs w:val="20"/>
               </w:rPr>
-              <w:t xml:space="preserve">i18n 字符串表 (中/英)</w:t>
+              <w:t xml:space="preserve">Agent 像素角色 SKNode</w:t>
             </w:r>
           </w:p>
         </w:tc>
@@ -23547,7 +25864,7 @@
                 <w:sz w:val="20"/>
                 <w:szCs w:val="20"/>
               </w:rPr>
-              <w:t xml:space="preserve">  Resources/Assets.xcassets</w:t>
+              <w:t xml:space="preserve">  PixelOffice/FurnitureNode.swift</w:t>
             </w:r>
           </w:p>
         </w:tc>
@@ -23580,7 +25897,7 @@
                 <w:sz w:val="20"/>
                 <w:szCs w:val="20"/>
               </w:rPr>
-              <w:t xml:space="preserve">图标、颜色资源</w:t>
+              <w:t xml:space="preserve">家具节点</w:t>
             </w:r>
           </w:p>
         </w:tc>
@@ -23614,6 +25931,207 @@
                 <w:sz w:val="20"/>
                 <w:szCs w:val="20"/>
               </w:rPr>
+              <w:t xml:space="preserve">  Resources/</w:t>
+            </w:r>
+          </w:p>
+        </w:tc>
+        <w:tc>
+          <w:tcPr>
+            <w:tcW w:type="dxa" w:w="4560"/>
+            <w:tcBorders>
+              <w:top w:val="single" w:color="CBD5E1" w:sz="1"/>
+              <w:left w:val="single" w:color="CBD5E1" w:sz="1"/>
+              <w:bottom w:val="single" w:color="CBD5E1" w:sz="1"/>
+              <w:right w:val="single" w:color="CBD5E1" w:sz="1"/>
+            </w:tcBorders>
+            <w:tcMar>
+              <w:top w:type="dxa" w:w="60"/>
+              <w:left w:type="dxa" w:w="120"/>
+              <w:bottom w:type="dxa" w:w="60"/>
+              <w:right w:type="dxa" w:w="120"/>
+            </w:tcMar>
+            <w:vAlign w:val="center"/>
+          </w:tcPr>
+          <w:p>
+            <w:pPr>
+              <w:spacing w:after="0"/>
+            </w:pPr>
+            <w:r>
+              <w:rPr>
+                <w:rFonts w:ascii="Arial" w:cs="Arial" w:eastAsia="Arial" w:hAnsi="Arial"/>
+                <w:color w:val="1E293B"/>
+                <w:sz w:val="20"/>
+                <w:szCs w:val="20"/>
+              </w:rPr>
+              <w:t xml:space="preserve">资源文件</w:t>
+            </w:r>
+          </w:p>
+        </w:tc>
+      </w:tr>
+      <w:tr>
+        <w:tc>
+          <w:tcPr>
+            <w:tcW w:type="dxa" w:w="4800"/>
+            <w:tcBorders>
+              <w:top w:val="single" w:color="CBD5E1" w:sz="1"/>
+              <w:left w:val="single" w:color="CBD5E1" w:sz="1"/>
+              <w:bottom w:val="single" w:color="CBD5E1" w:sz="1"/>
+              <w:right w:val="single" w:color="CBD5E1" w:sz="1"/>
+            </w:tcBorders>
+            <w:shd w:fill="F8FAFC" w:val="clear"/>
+            <w:tcMar>
+              <w:top w:type="dxa" w:w="60"/>
+              <w:left w:type="dxa" w:w="120"/>
+              <w:bottom w:type="dxa" w:w="60"/>
+              <w:right w:type="dxa" w:w="120"/>
+            </w:tcMar>
+            <w:vAlign w:val="center"/>
+          </w:tcPr>
+          <w:p>
+            <w:pPr>
+              <w:spacing w:after="0"/>
+            </w:pPr>
+            <w:r>
+              <w:rPr>
+                <w:rFonts w:ascii="Arial" w:cs="Arial" w:eastAsia="Arial" w:hAnsi="Arial"/>
+                <w:color w:val="1E293B"/>
+                <w:sz w:val="20"/>
+                <w:szCs w:val="20"/>
+              </w:rPr>
+              <w:t xml:space="preserve">  Resources/Localizable.xcstrings</w:t>
+            </w:r>
+          </w:p>
+        </w:tc>
+        <w:tc>
+          <w:tcPr>
+            <w:tcW w:type="dxa" w:w="4560"/>
+            <w:tcBorders>
+              <w:top w:val="single" w:color="CBD5E1" w:sz="1"/>
+              <w:left w:val="single" w:color="CBD5E1" w:sz="1"/>
+              <w:bottom w:val="single" w:color="CBD5E1" w:sz="1"/>
+              <w:right w:val="single" w:color="CBD5E1" w:sz="1"/>
+            </w:tcBorders>
+            <w:shd w:fill="F8FAFC" w:val="clear"/>
+            <w:tcMar>
+              <w:top w:type="dxa" w:w="60"/>
+              <w:left w:type="dxa" w:w="120"/>
+              <w:bottom w:type="dxa" w:w="60"/>
+              <w:right w:type="dxa" w:w="120"/>
+            </w:tcMar>
+            <w:vAlign w:val="center"/>
+          </w:tcPr>
+          <w:p>
+            <w:pPr>
+              <w:spacing w:after="0"/>
+            </w:pPr>
+            <w:r>
+              <w:rPr>
+                <w:rFonts w:ascii="Arial" w:cs="Arial" w:eastAsia="Arial" w:hAnsi="Arial"/>
+                <w:color w:val="1E293B"/>
+                <w:sz w:val="20"/>
+                <w:szCs w:val="20"/>
+              </w:rPr>
+              <w:t xml:space="preserve">i18n 字符串表 (中/英)</w:t>
+            </w:r>
+          </w:p>
+        </w:tc>
+      </w:tr>
+      <w:tr>
+        <w:tc>
+          <w:tcPr>
+            <w:tcW w:type="dxa" w:w="4800"/>
+            <w:tcBorders>
+              <w:top w:val="single" w:color="CBD5E1" w:sz="1"/>
+              <w:left w:val="single" w:color="CBD5E1" w:sz="1"/>
+              <w:bottom w:val="single" w:color="CBD5E1" w:sz="1"/>
+              <w:right w:val="single" w:color="CBD5E1" w:sz="1"/>
+            </w:tcBorders>
+            <w:tcMar>
+              <w:top w:type="dxa" w:w="60"/>
+              <w:left w:type="dxa" w:w="120"/>
+              <w:bottom w:type="dxa" w:w="60"/>
+              <w:right w:type="dxa" w:w="120"/>
+            </w:tcMar>
+            <w:vAlign w:val="center"/>
+          </w:tcPr>
+          <w:p>
+            <w:pPr>
+              <w:spacing w:after="0"/>
+            </w:pPr>
+            <w:r>
+              <w:rPr>
+                <w:rFonts w:ascii="Arial" w:cs="Arial" w:eastAsia="Arial" w:hAnsi="Arial"/>
+                <w:color w:val="1E293B"/>
+                <w:sz w:val="20"/>
+                <w:szCs w:val="20"/>
+              </w:rPr>
+              <w:t xml:space="preserve">  Resources/Assets.xcassets</w:t>
+            </w:r>
+          </w:p>
+        </w:tc>
+        <w:tc>
+          <w:tcPr>
+            <w:tcW w:type="dxa" w:w="4560"/>
+            <w:tcBorders>
+              <w:top w:val="single" w:color="CBD5E1" w:sz="1"/>
+              <w:left w:val="single" w:color="CBD5E1" w:sz="1"/>
+              <w:bottom w:val="single" w:color="CBD5E1" w:sz="1"/>
+              <w:right w:val="single" w:color="CBD5E1" w:sz="1"/>
+            </w:tcBorders>
+            <w:tcMar>
+              <w:top w:type="dxa" w:w="60"/>
+              <w:left w:type="dxa" w:w="120"/>
+              <w:bottom w:type="dxa" w:w="60"/>
+              <w:right w:type="dxa" w:w="120"/>
+            </w:tcMar>
+            <w:vAlign w:val="center"/>
+          </w:tcPr>
+          <w:p>
+            <w:pPr>
+              <w:spacing w:after="0"/>
+            </w:pPr>
+            <w:r>
+              <w:rPr>
+                <w:rFonts w:ascii="Arial" w:cs="Arial" w:eastAsia="Arial" w:hAnsi="Arial"/>
+                <w:color w:val="1E293B"/>
+                <w:sz w:val="20"/>
+                <w:szCs w:val="20"/>
+              </w:rPr>
+              <w:t xml:space="preserve">图标、颜色资源</w:t>
+            </w:r>
+          </w:p>
+        </w:tc>
+      </w:tr>
+      <w:tr>
+        <w:tc>
+          <w:tcPr>
+            <w:tcW w:type="dxa" w:w="4800"/>
+            <w:tcBorders>
+              <w:top w:val="single" w:color="CBD5E1" w:sz="1"/>
+              <w:left w:val="single" w:color="CBD5E1" w:sz="1"/>
+              <w:bottom w:val="single" w:color="CBD5E1" w:sz="1"/>
+              <w:right w:val="single" w:color="CBD5E1" w:sz="1"/>
+            </w:tcBorders>
+            <w:shd w:fill="F8FAFC" w:val="clear"/>
+            <w:tcMar>
+              <w:top w:type="dxa" w:w="60"/>
+              <w:left w:type="dxa" w:w="120"/>
+              <w:bottom w:type="dxa" w:w="60"/>
+              <w:right w:type="dxa" w:w="120"/>
+            </w:tcMar>
+            <w:vAlign w:val="center"/>
+          </w:tcPr>
+          <w:p>
+            <w:pPr>
+              <w:spacing w:after="0"/>
+            </w:pPr>
+            <w:r>
+              <w:rPr>
+                <w:rFonts w:ascii="Arial" w:cs="Arial" w:eastAsia="Arial" w:hAnsi="Arial"/>
+                <w:color w:val="1E293B"/>
+                <w:sz w:val="20"/>
+                <w:szCs w:val="20"/>
+              </w:rPr>
               <w:t xml:space="preserve">  Resources/MockData.swift</w:t>
             </w:r>
           </w:p>
@@ -23627,6 +26145,7 @@
               <w:bottom w:val="single" w:color="CBD5E1" w:sz="1"/>
               <w:right w:val="single" w:color="CBD5E1" w:sz="1"/>
             </w:tcBorders>
+            <w:shd w:fill="F8FAFC" w:val="clear"/>
             <w:tcMar>
               <w:top w:type="dxa" w:w="60"/>
               <w:left w:type="dxa" w:w="120"/>
@@ -26114,6 +28633,25 @@
           <w:sz w:val="22"/>
           <w:szCs w:val="22"/>
         </w:rPr>
+        <w:t xml:space="preserve">4 个 Cron 任务: 每日简报 / 周报 / 服务器检查 (enabled) + 一次性提醒 (disabled)</w:t>
+      </w:r>
+    </w:p>
+    <w:p>
+      <w:pPr>
+        <w:pStyle w:val="ListParagraph"/>
+        <w:numPr>
+          <w:ilvl w:val="0"/>
+          <w:numId w:val="5"/>
+        </w:numPr>
+        <w:spacing w:after="70" w:line="300"/>
+      </w:pPr>
+      <w:r>
+        <w:rPr>
+          <w:rFonts w:ascii="Arial" w:cs="Arial" w:eastAsia="Arial" w:hAnsi="Arial"/>
+          <w:color w:val="1E293B"/>
+          <w:sz w:val="22"/>
+          <w:szCs w:val="22"/>
+        </w:rPr>
         <w:t xml:space="preserve">UI 顶部显示黄色 Banner: “当前显示示例数据，未检测到 OpenClaw 配置”</w:t>
       </w:r>
     </w:p>
@@ -27693,6 +30231,104 @@
           </w:p>
         </w:tc>
       </w:tr>
+      <w:tr>
+        <w:tc>
+          <w:tcPr>
+            <w:tcW w:type="dxa" w:w="500"/>
+            <w:tcBorders>
+              <w:top w:val="single" w:color="CBD5E1" w:sz="1"/>
+              <w:left w:val="single" w:color="CBD5E1" w:sz="1"/>
+              <w:bottom w:val="single" w:color="CBD5E1" w:sz="1"/>
+              <w:right w:val="single" w:color="CBD5E1" w:sz="1"/>
+            </w:tcBorders>
+            <w:tcMar>
+              <w:top w:type="dxa" w:w="60"/>
+              <w:left w:type="dxa" w:w="120"/>
+              <w:bottom w:type="dxa" w:w="60"/>
+              <w:right w:type="dxa" w:w="120"/>
+            </w:tcMar>
+            <w:vAlign w:val="center"/>
+          </w:tcPr>
+          <w:p>
+            <w:pPr>
+              <w:spacing w:after="0"/>
+            </w:pPr>
+            <w:r>
+              <w:rPr>
+                <w:rFonts w:ascii="Arial" w:cs="Arial" w:eastAsia="Arial" w:hAnsi="Arial"/>
+                <w:color w:val="1E293B"/>
+                <w:sz w:val="20"/>
+                <w:szCs w:val="20"/>
+              </w:rPr>
+              <w:t xml:space="preserve">14</w:t>
+            </w:r>
+          </w:p>
+        </w:tc>
+        <w:tc>
+          <w:tcPr>
+            <w:tcW w:type="dxa" w:w="1800"/>
+            <w:tcBorders>
+              <w:top w:val="single" w:color="CBD5E1" w:sz="1"/>
+              <w:left w:val="single" w:color="CBD5E1" w:sz="1"/>
+              <w:bottom w:val="single" w:color="CBD5E1" w:sz="1"/>
+              <w:right w:val="single" w:color="CBD5E1" w:sz="1"/>
+            </w:tcBorders>
+            <w:tcMar>
+              <w:top w:type="dxa" w:w="60"/>
+              <w:left w:type="dxa" w:w="120"/>
+              <w:bottom w:type="dxa" w:w="60"/>
+              <w:right w:type="dxa" w:w="120"/>
+            </w:tcMar>
+            <w:vAlign w:val="center"/>
+          </w:tcPr>
+          <w:p>
+            <w:pPr>
+              <w:spacing w:after="0"/>
+            </w:pPr>
+            <w:r>
+              <w:rPr>
+                <w:rFonts w:ascii="Arial" w:cs="Arial" w:eastAsia="Arial" w:hAnsi="Arial"/>
+                <w:color w:val="1E293B"/>
+                <w:sz w:val="20"/>
+                <w:szCs w:val="20"/>
+              </w:rPr>
+              <w:t xml:space="preserve">Cron 任务</w:t>
+            </w:r>
+          </w:p>
+        </w:tc>
+        <w:tc>
+          <w:tcPr>
+            <w:tcW w:type="dxa" w:w="7060"/>
+            <w:tcBorders>
+              <w:top w:val="single" w:color="CBD5E1" w:sz="1"/>
+              <w:left w:val="single" w:color="CBD5E1" w:sz="1"/>
+              <w:bottom w:val="single" w:color="CBD5E1" w:sz="1"/>
+              <w:right w:val="single" w:color="CBD5E1" w:sz="1"/>
+            </w:tcBorders>
+            <w:tcMar>
+              <w:top w:type="dxa" w:w="60"/>
+              <w:left w:type="dxa" w:w="120"/>
+              <w:bottom w:type="dxa" w:w="60"/>
+              <w:right w:type="dxa" w:w="120"/>
+            </w:tcMar>
+            <w:vAlign w:val="center"/>
+          </w:tcPr>
+          <w:p>
+            <w:pPr>
+              <w:spacing w:after="0"/>
+            </w:pPr>
+            <w:r>
+              <w:rPr>
+                <w:rFonts w:ascii="Arial" w:cs="Arial" w:eastAsia="Arial" w:hAnsi="Arial"/>
+                <w:color w:val="1E293B"/>
+                <w:sz w:val="20"/>
+                <w:szCs w:val="20"/>
+              </w:rPr>
+              <w:t xml:space="preserve">显示所有任务、调度表达式可读、启用/禁用/立即运行可用</w:t>
+            </w:r>
+          </w:p>
+        </w:tc>
+      </w:tr>
     </w:tbl>
     <w:p>
       <w:pPr>
@@ -27858,7 +30494,7 @@
                 <w:sz w:val="20"/>
                 <w:szCs w:val="20"/>
               </w:rPr>
-              <w:t xml:space="preserve">14</w:t>
+              <w:t xml:space="preserve">15</w:t>
             </w:r>
           </w:p>
         </w:tc>
@@ -27957,7 +30593,7 @@
                 <w:sz w:val="20"/>
                 <w:szCs w:val="20"/>
               </w:rPr>
-              <w:t xml:space="preserve">15</w:t>
+              <w:t xml:space="preserve">16</w:t>
             </w:r>
           </w:p>
         </w:tc>
@@ -28057,7 +30693,7 @@
                 <w:sz w:val="20"/>
                 <w:szCs w:val="20"/>
               </w:rPr>
-              <w:t xml:space="preserve">16</w:t>
+              <w:t xml:space="preserve">17</w:t>
             </w:r>
           </w:p>
         </w:tc>
@@ -28156,7 +30792,7 @@
                 <w:sz w:val="20"/>
                 <w:szCs w:val="20"/>
               </w:rPr>
-              <w:t xml:space="preserve">17</w:t>
+              <w:t xml:space="preserve">18</w:t>
             </w:r>
           </w:p>
         </w:tc>
@@ -28256,7 +30892,7 @@
                 <w:sz w:val="20"/>
                 <w:szCs w:val="20"/>
               </w:rPr>
-              <w:t xml:space="preserve">18</w:t>
+              <w:t xml:space="preserve">19</w:t>
             </w:r>
           </w:p>
         </w:tc>
@@ -28490,7 +31126,7 @@
                 <w:sz w:val="20"/>
                 <w:szCs w:val="20"/>
               </w:rPr>
-              <w:t xml:space="preserve">19</w:t>
+              <w:t xml:space="preserve">20</w:t>
             </w:r>
           </w:p>
         </w:tc>
@@ -28589,7 +31225,7 @@
                 <w:sz w:val="20"/>
                 <w:szCs w:val="20"/>
               </w:rPr>
-              <w:t xml:space="preserve">20</w:t>
+              <w:t xml:space="preserve">21</w:t>
             </w:r>
           </w:p>
         </w:tc>
@@ -28689,7 +31325,7 @@
                 <w:sz w:val="20"/>
                 <w:szCs w:val="20"/>
               </w:rPr>
-              <w:t xml:space="preserve">21</w:t>
+              <w:t xml:space="preserve">22</w:t>
             </w:r>
           </w:p>
         </w:tc>
@@ -28788,7 +31424,7 @@
                 <w:sz w:val="20"/>
                 <w:szCs w:val="20"/>
               </w:rPr>
-              <w:t xml:space="preserve">22</w:t>
+              <w:t xml:space="preserve">23</w:t>
             </w:r>
           </w:p>
         </w:tc>
@@ -28888,7 +31524,7 @@
                 <w:sz w:val="20"/>
                 <w:szCs w:val="20"/>
               </w:rPr>
-              <w:t xml:space="preserve">23</w:t>
+              <w:t xml:space="preserve">24</w:t>
             </w:r>
           </w:p>
         </w:tc>
@@ -28987,7 +31623,7 @@
                 <w:sz w:val="20"/>
                 <w:szCs w:val="20"/>
               </w:rPr>
-              <w:t xml:space="preserve">24</w:t>
+              <w:t xml:space="preserve">25</w:t>
             </w:r>
           </w:p>
         </w:tc>
@@ -29087,7 +31723,7 @@
                 <w:sz w:val="20"/>
                 <w:szCs w:val="20"/>
               </w:rPr>
-              <w:t xml:space="preserve">25</w:t>
+              <w:t xml:space="preserve">26</w:t>
             </w:r>
           </w:p>
         </w:tc>

</xml_diff>